<commit_message>
etapa 4 e 5
</commit_message>
<xml_diff>
--- a/Documentos/ETAPA 1.docx
+++ b/Documentos/ETAPA 1.docx
@@ -44,7 +44,23 @@
           <w:b/>
           <w:bCs/>
         </w:rPr>
-        <w:t>F1 (Formula 1 Database)</w:t>
+        <w:t xml:space="preserve">F1 (Formula 1 </w:t>
+      </w:r>
+      <w:proofErr w:type="spellStart"/>
+      <w:r>
+        <w:rPr>
+          <w:b/>
+          <w:bCs/>
+        </w:rPr>
+        <w:t>Database</w:t>
+      </w:r>
+      <w:proofErr w:type="spellEnd"/>
+      <w:r>
+        <w:rPr>
+          <w:b/>
+          <w:bCs/>
+        </w:rPr>
+        <w:t>)</w:t>
       </w:r>
     </w:p>
     <w:p>
@@ -91,7 +107,23 @@
           <w:b/>
           <w:bCs/>
         </w:rPr>
-        <w:t>A base F1 pertence ao domínio do esporte automobilístico e reúne informações históricas sobre o Campeonato Mundial de Fórmula 1. Os dados contemplam pilotos, equipes, circuitos, corridas, classificações, resultados, tempos de volta, pit stops e temporadas.</w:t>
+        <w:t xml:space="preserve">A base F1 pertence ao domínio do esporte automobilístico e reúne informações históricas sobre o Campeonato Mundial de Fórmula 1. Os dados contemplam pilotos, equipes, circuitos, corridas, classificações, resultados, tempos de volta, pit </w:t>
+      </w:r>
+      <w:proofErr w:type="spellStart"/>
+      <w:r>
+        <w:rPr>
+          <w:b/>
+          <w:bCs/>
+        </w:rPr>
+        <w:t>stops</w:t>
+      </w:r>
+      <w:proofErr w:type="spellEnd"/>
+      <w:r>
+        <w:rPr>
+          <w:b/>
+          <w:bCs/>
+        </w:rPr>
+        <w:t xml:space="preserve"> e temporadas.</w:t>
       </w:r>
     </w:p>
     <w:p>
@@ -255,6 +287,7 @@
                 <w:bCs/>
               </w:rPr>
             </w:pPr>
+            <w:proofErr w:type="spellStart"/>
             <w:r>
               <w:rPr>
                 <w:b/>
@@ -262,6 +295,7 @@
               </w:rPr>
               <w:t>circuits</w:t>
             </w:r>
+            <w:proofErr w:type="spellEnd"/>
           </w:p>
         </w:tc>
         <w:tc>
@@ -348,6 +382,7 @@
                 <w:bCs/>
               </w:rPr>
             </w:pPr>
+            <w:proofErr w:type="spellStart"/>
             <w:r>
               <w:rPr>
                 <w:b/>
@@ -355,6 +390,7 @@
               </w:rPr>
               <w:t>constructor_results</w:t>
             </w:r>
+            <w:proofErr w:type="spellEnd"/>
           </w:p>
         </w:tc>
         <w:tc>
@@ -441,6 +477,7 @@
                 <w:bCs/>
               </w:rPr>
             </w:pPr>
+            <w:proofErr w:type="spellStart"/>
             <w:r>
               <w:rPr>
                 <w:b/>
@@ -448,6 +485,7 @@
               </w:rPr>
               <w:t>constructor_standings</w:t>
             </w:r>
+            <w:proofErr w:type="spellEnd"/>
           </w:p>
         </w:tc>
         <w:tc>
@@ -534,6 +572,7 @@
                 <w:bCs/>
               </w:rPr>
             </w:pPr>
+            <w:proofErr w:type="spellStart"/>
             <w:r>
               <w:rPr>
                 <w:b/>
@@ -541,6 +580,7 @@
               </w:rPr>
               <w:t>constructors</w:t>
             </w:r>
+            <w:proofErr w:type="spellEnd"/>
           </w:p>
         </w:tc>
         <w:tc>
@@ -627,6 +667,7 @@
                 <w:bCs/>
               </w:rPr>
             </w:pPr>
+            <w:proofErr w:type="spellStart"/>
             <w:r>
               <w:rPr>
                 <w:b/>
@@ -634,6 +675,7 @@
               </w:rPr>
               <w:t>driver_standings</w:t>
             </w:r>
+            <w:proofErr w:type="spellEnd"/>
           </w:p>
         </w:tc>
         <w:tc>
@@ -813,6 +855,7 @@
                 <w:bCs/>
               </w:rPr>
             </w:pPr>
+            <w:proofErr w:type="spellStart"/>
             <w:r>
               <w:rPr>
                 <w:b/>
@@ -820,6 +863,7 @@
               </w:rPr>
               <w:t>lap_times</w:t>
             </w:r>
+            <w:proofErr w:type="spellEnd"/>
           </w:p>
         </w:tc>
         <w:tc>
@@ -906,6 +950,7 @@
                 <w:bCs/>
               </w:rPr>
             </w:pPr>
+            <w:proofErr w:type="spellStart"/>
             <w:r>
               <w:rPr>
                 <w:b/>
@@ -913,6 +958,7 @@
               </w:rPr>
               <w:t>pit_stops</w:t>
             </w:r>
+            <w:proofErr w:type="spellEnd"/>
           </w:p>
         </w:tc>
         <w:tc>
@@ -999,6 +1045,7 @@
                 <w:bCs/>
               </w:rPr>
             </w:pPr>
+            <w:proofErr w:type="spellStart"/>
             <w:r>
               <w:rPr>
                 <w:b/>
@@ -1006,6 +1053,7 @@
               </w:rPr>
               <w:t>position_descriptions</w:t>
             </w:r>
+            <w:proofErr w:type="spellEnd"/>
           </w:p>
         </w:tc>
         <w:tc>
@@ -1092,6 +1140,7 @@
                 <w:bCs/>
               </w:rPr>
             </w:pPr>
+            <w:proofErr w:type="spellStart"/>
             <w:r>
               <w:rPr>
                 <w:b/>
@@ -1099,6 +1148,7 @@
               </w:rPr>
               <w:t>qualifying</w:t>
             </w:r>
+            <w:proofErr w:type="spellEnd"/>
           </w:p>
         </w:tc>
         <w:tc>
@@ -1185,6 +1235,7 @@
                 <w:bCs/>
               </w:rPr>
             </w:pPr>
+            <w:proofErr w:type="spellStart"/>
             <w:r>
               <w:rPr>
                 <w:b/>
@@ -1192,6 +1243,7 @@
               </w:rPr>
               <w:t>races</w:t>
             </w:r>
+            <w:proofErr w:type="spellEnd"/>
           </w:p>
         </w:tc>
         <w:tc>
@@ -1278,6 +1330,7 @@
                 <w:bCs/>
               </w:rPr>
             </w:pPr>
+            <w:proofErr w:type="spellStart"/>
             <w:r>
               <w:rPr>
                 <w:b/>
@@ -1285,6 +1338,7 @@
               </w:rPr>
               <w:t>results</w:t>
             </w:r>
+            <w:proofErr w:type="spellEnd"/>
           </w:p>
         </w:tc>
         <w:tc>
@@ -1371,6 +1425,7 @@
                 <w:bCs/>
               </w:rPr>
             </w:pPr>
+            <w:proofErr w:type="spellStart"/>
             <w:r>
               <w:rPr>
                 <w:b/>
@@ -1378,6 +1433,7 @@
               </w:rPr>
               <w:t>seasons</w:t>
             </w:r>
+            <w:proofErr w:type="spellEnd"/>
           </w:p>
         </w:tc>
         <w:tc>
@@ -1464,6 +1520,7 @@
                 <w:bCs/>
               </w:rPr>
             </w:pPr>
+            <w:proofErr w:type="spellStart"/>
             <w:r>
               <w:rPr>
                 <w:b/>
@@ -1471,6 +1528,7 @@
               </w:rPr>
               <w:t>sprint_results</w:t>
             </w:r>
+            <w:proofErr w:type="spellEnd"/>
           </w:p>
         </w:tc>
         <w:tc>
@@ -1926,6 +1984,7 @@
                 <w:bCs/>
               </w:rPr>
             </w:pPr>
+            <w:proofErr w:type="spellStart"/>
             <w:r>
               <w:rPr>
                 <w:b/>
@@ -1933,21 +1992,23 @@
               </w:rPr>
               <w:t>circuits</w:t>
             </w:r>
-          </w:p>
-        </w:tc>
-        <w:tc>
-          <w:tcPr>
-            <w:tcW w:w="0" w:type="auto"/>
-            <w:vAlign w:val="center"/>
-            <w:hideMark/>
-          </w:tcPr>
-          <w:p>
-            <w:pPr>
-              <w:rPr>
-                <w:b/>
-                <w:bCs/>
-              </w:rPr>
-            </w:pPr>
+            <w:proofErr w:type="spellEnd"/>
+          </w:p>
+        </w:tc>
+        <w:tc>
+          <w:tcPr>
+            <w:tcW w:w="0" w:type="auto"/>
+            <w:vAlign w:val="center"/>
+            <w:hideMark/>
+          </w:tcPr>
+          <w:p>
+            <w:pPr>
+              <w:rPr>
+                <w:b/>
+                <w:bCs/>
+              </w:rPr>
+            </w:pPr>
+            <w:proofErr w:type="spellStart"/>
             <w:r>
               <w:rPr>
                 <w:b/>
@@ -1955,21 +2016,23 @@
               </w:rPr>
               <w:t>circuitId</w:t>
             </w:r>
-          </w:p>
-        </w:tc>
-        <w:tc>
-          <w:tcPr>
-            <w:tcW w:w="0" w:type="auto"/>
-            <w:vAlign w:val="center"/>
-            <w:hideMark/>
-          </w:tcPr>
-          <w:p>
-            <w:pPr>
-              <w:rPr>
-                <w:b/>
-                <w:bCs/>
-              </w:rPr>
-            </w:pPr>
+            <w:proofErr w:type="spellEnd"/>
+          </w:p>
+        </w:tc>
+        <w:tc>
+          <w:tcPr>
+            <w:tcW w:w="0" w:type="auto"/>
+            <w:vAlign w:val="center"/>
+            <w:hideMark/>
+          </w:tcPr>
+          <w:p>
+            <w:pPr>
+              <w:rPr>
+                <w:b/>
+                <w:bCs/>
+              </w:rPr>
+            </w:pPr>
+            <w:proofErr w:type="spellStart"/>
             <w:r>
               <w:rPr>
                 <w:b/>
@@ -1977,6 +2040,7 @@
               </w:rPr>
               <w:t>races</w:t>
             </w:r>
+            <w:proofErr w:type="spellEnd"/>
           </w:p>
         </w:tc>
       </w:tr>
@@ -2019,6 +2083,7 @@
                 <w:bCs/>
               </w:rPr>
             </w:pPr>
+            <w:proofErr w:type="spellStart"/>
             <w:r>
               <w:rPr>
                 <w:b/>
@@ -2026,28 +2091,111 @@
               </w:rPr>
               <w:t>driverId</w:t>
             </w:r>
-          </w:p>
-        </w:tc>
-        <w:tc>
-          <w:tcPr>
-            <w:tcW w:w="0" w:type="auto"/>
-            <w:vAlign w:val="center"/>
-            <w:hideMark/>
-          </w:tcPr>
-          <w:p>
-            <w:pPr>
-              <w:rPr>
-                <w:b/>
-                <w:bCs/>
-              </w:rPr>
-            </w:pPr>
-            <w:r>
-              <w:rPr>
-                <w:b/>
-                <w:bCs/>
-              </w:rPr>
-              <w:t>driver_standings, lap_times, pit_stops, qualifying, results, sprint_results</w:t>
-            </w:r>
+            <w:proofErr w:type="spellEnd"/>
+          </w:p>
+        </w:tc>
+        <w:tc>
+          <w:tcPr>
+            <w:tcW w:w="0" w:type="auto"/>
+            <w:vAlign w:val="center"/>
+            <w:hideMark/>
+          </w:tcPr>
+          <w:p>
+            <w:pPr>
+              <w:rPr>
+                <w:b/>
+                <w:bCs/>
+              </w:rPr>
+            </w:pPr>
+            <w:proofErr w:type="spellStart"/>
+            <w:r>
+              <w:rPr>
+                <w:b/>
+                <w:bCs/>
+              </w:rPr>
+              <w:t>driver_standings</w:t>
+            </w:r>
+            <w:proofErr w:type="spellEnd"/>
+            <w:r>
+              <w:rPr>
+                <w:b/>
+                <w:bCs/>
+              </w:rPr>
+              <w:t xml:space="preserve">, </w:t>
+            </w:r>
+            <w:proofErr w:type="spellStart"/>
+            <w:r>
+              <w:rPr>
+                <w:b/>
+                <w:bCs/>
+              </w:rPr>
+              <w:t>lap_times</w:t>
+            </w:r>
+            <w:proofErr w:type="spellEnd"/>
+            <w:r>
+              <w:rPr>
+                <w:b/>
+                <w:bCs/>
+              </w:rPr>
+              <w:t xml:space="preserve">, </w:t>
+            </w:r>
+            <w:proofErr w:type="spellStart"/>
+            <w:r>
+              <w:rPr>
+                <w:b/>
+                <w:bCs/>
+              </w:rPr>
+              <w:t>pit_stops</w:t>
+            </w:r>
+            <w:proofErr w:type="spellEnd"/>
+            <w:r>
+              <w:rPr>
+                <w:b/>
+                <w:bCs/>
+              </w:rPr>
+              <w:t xml:space="preserve">, </w:t>
+            </w:r>
+            <w:proofErr w:type="spellStart"/>
+            <w:r>
+              <w:rPr>
+                <w:b/>
+                <w:bCs/>
+              </w:rPr>
+              <w:t>qualifying</w:t>
+            </w:r>
+            <w:proofErr w:type="spellEnd"/>
+            <w:r>
+              <w:rPr>
+                <w:b/>
+                <w:bCs/>
+              </w:rPr>
+              <w:t xml:space="preserve">, </w:t>
+            </w:r>
+            <w:proofErr w:type="spellStart"/>
+            <w:r>
+              <w:rPr>
+                <w:b/>
+                <w:bCs/>
+              </w:rPr>
+              <w:t>results</w:t>
+            </w:r>
+            <w:proofErr w:type="spellEnd"/>
+            <w:r>
+              <w:rPr>
+                <w:b/>
+                <w:bCs/>
+              </w:rPr>
+              <w:t xml:space="preserve">, </w:t>
+            </w:r>
+            <w:proofErr w:type="spellStart"/>
+            <w:r>
+              <w:rPr>
+                <w:b/>
+                <w:bCs/>
+              </w:rPr>
+              <w:t>sprint_results</w:t>
+            </w:r>
+            <w:proofErr w:type="spellEnd"/>
           </w:p>
         </w:tc>
       </w:tr>
@@ -2068,6 +2216,7 @@
                 <w:bCs/>
               </w:rPr>
             </w:pPr>
+            <w:proofErr w:type="spellStart"/>
             <w:r>
               <w:rPr>
                 <w:b/>
@@ -2075,21 +2224,23 @@
               </w:rPr>
               <w:t>constructors</w:t>
             </w:r>
-          </w:p>
-        </w:tc>
-        <w:tc>
-          <w:tcPr>
-            <w:tcW w:w="0" w:type="auto"/>
-            <w:vAlign w:val="center"/>
-            <w:hideMark/>
-          </w:tcPr>
-          <w:p>
-            <w:pPr>
-              <w:rPr>
-                <w:b/>
-                <w:bCs/>
-              </w:rPr>
-            </w:pPr>
+            <w:proofErr w:type="spellEnd"/>
+          </w:p>
+        </w:tc>
+        <w:tc>
+          <w:tcPr>
+            <w:tcW w:w="0" w:type="auto"/>
+            <w:vAlign w:val="center"/>
+            <w:hideMark/>
+          </w:tcPr>
+          <w:p>
+            <w:pPr>
+              <w:rPr>
+                <w:b/>
+                <w:bCs/>
+              </w:rPr>
+            </w:pPr>
+            <w:proofErr w:type="spellStart"/>
             <w:r>
               <w:rPr>
                 <w:b/>
@@ -2097,28 +2248,95 @@
               </w:rPr>
               <w:t>constructorId</w:t>
             </w:r>
-          </w:p>
-        </w:tc>
-        <w:tc>
-          <w:tcPr>
-            <w:tcW w:w="0" w:type="auto"/>
-            <w:vAlign w:val="center"/>
-            <w:hideMark/>
-          </w:tcPr>
-          <w:p>
-            <w:pPr>
-              <w:rPr>
-                <w:b/>
-                <w:bCs/>
-              </w:rPr>
-            </w:pPr>
-            <w:r>
-              <w:rPr>
-                <w:b/>
-                <w:bCs/>
-              </w:rPr>
-              <w:t>constructor_results, constructor_standings, qualifying, results, sprint_results</w:t>
-            </w:r>
+            <w:proofErr w:type="spellEnd"/>
+          </w:p>
+        </w:tc>
+        <w:tc>
+          <w:tcPr>
+            <w:tcW w:w="0" w:type="auto"/>
+            <w:vAlign w:val="center"/>
+            <w:hideMark/>
+          </w:tcPr>
+          <w:p>
+            <w:pPr>
+              <w:rPr>
+                <w:b/>
+                <w:bCs/>
+              </w:rPr>
+            </w:pPr>
+            <w:proofErr w:type="spellStart"/>
+            <w:r>
+              <w:rPr>
+                <w:b/>
+                <w:bCs/>
+              </w:rPr>
+              <w:t>constructor_results</w:t>
+            </w:r>
+            <w:proofErr w:type="spellEnd"/>
+            <w:r>
+              <w:rPr>
+                <w:b/>
+                <w:bCs/>
+              </w:rPr>
+              <w:t xml:space="preserve">, </w:t>
+            </w:r>
+            <w:proofErr w:type="spellStart"/>
+            <w:r>
+              <w:rPr>
+                <w:b/>
+                <w:bCs/>
+              </w:rPr>
+              <w:t>constructor_standings</w:t>
+            </w:r>
+            <w:proofErr w:type="spellEnd"/>
+            <w:r>
+              <w:rPr>
+                <w:b/>
+                <w:bCs/>
+              </w:rPr>
+              <w:t xml:space="preserve">, </w:t>
+            </w:r>
+            <w:proofErr w:type="spellStart"/>
+            <w:r>
+              <w:rPr>
+                <w:b/>
+                <w:bCs/>
+              </w:rPr>
+              <w:t>qualifying</w:t>
+            </w:r>
+            <w:proofErr w:type="spellEnd"/>
+            <w:r>
+              <w:rPr>
+                <w:b/>
+                <w:bCs/>
+              </w:rPr>
+              <w:t xml:space="preserve">, </w:t>
+            </w:r>
+            <w:proofErr w:type="spellStart"/>
+            <w:r>
+              <w:rPr>
+                <w:b/>
+                <w:bCs/>
+              </w:rPr>
+              <w:t>results</w:t>
+            </w:r>
+            <w:proofErr w:type="spellEnd"/>
+            <w:r>
+              <w:rPr>
+                <w:b/>
+                <w:bCs/>
+              </w:rPr>
+              <w:t xml:space="preserve">, </w:t>
+            </w:r>
+            <w:proofErr w:type="spellStart"/>
+            <w:r>
+              <w:rPr>
+                <w:b/>
+                <w:bCs/>
+              </w:rPr>
+              <w:t>sprint_results</w:t>
+            </w:r>
+            <w:proofErr w:type="spellEnd"/>
           </w:p>
         </w:tc>
       </w:tr>
@@ -2139,6 +2357,7 @@
                 <w:bCs/>
               </w:rPr>
             </w:pPr>
+            <w:proofErr w:type="spellStart"/>
             <w:r>
               <w:rPr>
                 <w:b/>
@@ -2146,21 +2365,23 @@
               </w:rPr>
               <w:t>races</w:t>
             </w:r>
-          </w:p>
-        </w:tc>
-        <w:tc>
-          <w:tcPr>
-            <w:tcW w:w="0" w:type="auto"/>
-            <w:vAlign w:val="center"/>
-            <w:hideMark/>
-          </w:tcPr>
-          <w:p>
-            <w:pPr>
-              <w:rPr>
-                <w:b/>
-                <w:bCs/>
-              </w:rPr>
-            </w:pPr>
+            <w:proofErr w:type="spellEnd"/>
+          </w:p>
+        </w:tc>
+        <w:tc>
+          <w:tcPr>
+            <w:tcW w:w="0" w:type="auto"/>
+            <w:vAlign w:val="center"/>
+            <w:hideMark/>
+          </w:tcPr>
+          <w:p>
+            <w:pPr>
+              <w:rPr>
+                <w:b/>
+                <w:bCs/>
+              </w:rPr>
+            </w:pPr>
+            <w:proofErr w:type="spellStart"/>
             <w:r>
               <w:rPr>
                 <w:b/>
@@ -2168,28 +2389,143 @@
               </w:rPr>
               <w:t>raceId</w:t>
             </w:r>
-          </w:p>
-        </w:tc>
-        <w:tc>
-          <w:tcPr>
-            <w:tcW w:w="0" w:type="auto"/>
-            <w:vAlign w:val="center"/>
-            <w:hideMark/>
-          </w:tcPr>
-          <w:p>
-            <w:pPr>
-              <w:rPr>
-                <w:b/>
-                <w:bCs/>
-              </w:rPr>
-            </w:pPr>
-            <w:r>
-              <w:rPr>
-                <w:b/>
-                <w:bCs/>
-              </w:rPr>
-              <w:t>constructor_results, constructor_standings, driver_standings, lap_times, pit_stops, qualifying, results, sprint_results</w:t>
-            </w:r>
+            <w:proofErr w:type="spellEnd"/>
+          </w:p>
+        </w:tc>
+        <w:tc>
+          <w:tcPr>
+            <w:tcW w:w="0" w:type="auto"/>
+            <w:vAlign w:val="center"/>
+            <w:hideMark/>
+          </w:tcPr>
+          <w:p>
+            <w:pPr>
+              <w:rPr>
+                <w:b/>
+                <w:bCs/>
+              </w:rPr>
+            </w:pPr>
+            <w:proofErr w:type="spellStart"/>
+            <w:r>
+              <w:rPr>
+                <w:b/>
+                <w:bCs/>
+              </w:rPr>
+              <w:t>constructor_results</w:t>
+            </w:r>
+            <w:proofErr w:type="spellEnd"/>
+            <w:r>
+              <w:rPr>
+                <w:b/>
+                <w:bCs/>
+              </w:rPr>
+              <w:t xml:space="preserve">, </w:t>
+            </w:r>
+            <w:proofErr w:type="spellStart"/>
+            <w:r>
+              <w:rPr>
+                <w:b/>
+                <w:bCs/>
+              </w:rPr>
+              <w:t>constructor_standings</w:t>
+            </w:r>
+            <w:proofErr w:type="spellEnd"/>
+            <w:r>
+              <w:rPr>
+                <w:b/>
+                <w:bCs/>
+              </w:rPr>
+              <w:t xml:space="preserve">, </w:t>
+            </w:r>
+            <w:proofErr w:type="spellStart"/>
+            <w:r>
+              <w:rPr>
+                <w:b/>
+                <w:bCs/>
+              </w:rPr>
+              <w:t>driver_standings</w:t>
+            </w:r>
+            <w:proofErr w:type="spellEnd"/>
+            <w:r>
+              <w:rPr>
+                <w:b/>
+                <w:bCs/>
+              </w:rPr>
+              <w:t xml:space="preserve">, </w:t>
+            </w:r>
+            <w:proofErr w:type="spellStart"/>
+            <w:r>
+              <w:rPr>
+                <w:b/>
+                <w:bCs/>
+              </w:rPr>
+              <w:t>lap_times</w:t>
+            </w:r>
+            <w:proofErr w:type="spellEnd"/>
+            <w:r>
+              <w:rPr>
+                <w:b/>
+                <w:bCs/>
+              </w:rPr>
+              <w:t xml:space="preserve">, </w:t>
+            </w:r>
+            <w:proofErr w:type="spellStart"/>
+            <w:r>
+              <w:rPr>
+                <w:b/>
+                <w:bCs/>
+              </w:rPr>
+              <w:t>pit_stops</w:t>
+            </w:r>
+            <w:proofErr w:type="spellEnd"/>
+            <w:r>
+              <w:rPr>
+                <w:b/>
+                <w:bCs/>
+              </w:rPr>
+              <w:t xml:space="preserve">, </w:t>
+            </w:r>
+            <w:proofErr w:type="spellStart"/>
+            <w:r>
+              <w:rPr>
+                <w:b/>
+                <w:bCs/>
+              </w:rPr>
+              <w:t>qualifying</w:t>
+            </w:r>
+            <w:proofErr w:type="spellEnd"/>
+            <w:r>
+              <w:rPr>
+                <w:b/>
+                <w:bCs/>
+              </w:rPr>
+              <w:t xml:space="preserve">, </w:t>
+            </w:r>
+            <w:proofErr w:type="spellStart"/>
+            <w:r>
+              <w:rPr>
+                <w:b/>
+                <w:bCs/>
+              </w:rPr>
+              <w:t>results</w:t>
+            </w:r>
+            <w:proofErr w:type="spellEnd"/>
+            <w:r>
+              <w:rPr>
+                <w:b/>
+                <w:bCs/>
+              </w:rPr>
+              <w:t xml:space="preserve">, </w:t>
+            </w:r>
+            <w:proofErr w:type="spellStart"/>
+            <w:r>
+              <w:rPr>
+                <w:b/>
+                <w:bCs/>
+              </w:rPr>
+              <w:t>sprint_results</w:t>
+            </w:r>
+            <w:proofErr w:type="spellEnd"/>
           </w:p>
         </w:tc>
       </w:tr>
@@ -2232,6 +2568,7 @@
                 <w:bCs/>
               </w:rPr>
             </w:pPr>
+            <w:proofErr w:type="spellStart"/>
             <w:r>
               <w:rPr>
                 <w:b/>
@@ -2239,28 +2576,47 @@
               </w:rPr>
               <w:t>statusId</w:t>
             </w:r>
-          </w:p>
-        </w:tc>
-        <w:tc>
-          <w:tcPr>
-            <w:tcW w:w="0" w:type="auto"/>
-            <w:vAlign w:val="center"/>
-            <w:hideMark/>
-          </w:tcPr>
-          <w:p>
-            <w:pPr>
-              <w:rPr>
-                <w:b/>
-                <w:bCs/>
-              </w:rPr>
-            </w:pPr>
-            <w:r>
-              <w:rPr>
-                <w:b/>
-                <w:bCs/>
-              </w:rPr>
-              <w:t>results, sprint_results</w:t>
-            </w:r>
+            <w:proofErr w:type="spellEnd"/>
+          </w:p>
+        </w:tc>
+        <w:tc>
+          <w:tcPr>
+            <w:tcW w:w="0" w:type="auto"/>
+            <w:vAlign w:val="center"/>
+            <w:hideMark/>
+          </w:tcPr>
+          <w:p>
+            <w:pPr>
+              <w:rPr>
+                <w:b/>
+                <w:bCs/>
+              </w:rPr>
+            </w:pPr>
+            <w:proofErr w:type="spellStart"/>
+            <w:r>
+              <w:rPr>
+                <w:b/>
+                <w:bCs/>
+              </w:rPr>
+              <w:t>results</w:t>
+            </w:r>
+            <w:proofErr w:type="spellEnd"/>
+            <w:r>
+              <w:rPr>
+                <w:b/>
+                <w:bCs/>
+              </w:rPr>
+              <w:t xml:space="preserve">, </w:t>
+            </w:r>
+            <w:proofErr w:type="spellStart"/>
+            <w:r>
+              <w:rPr>
+                <w:b/>
+                <w:bCs/>
+              </w:rPr>
+              <w:t>sprint_results</w:t>
+            </w:r>
+            <w:proofErr w:type="spellEnd"/>
           </w:p>
         </w:tc>
       </w:tr>
@@ -2366,7 +2722,15 @@
     <w:p>
       <w:r>
         <w:lastRenderedPageBreak/>
-        <w:t>Foram analisadas apenas as tabelas principais da base de dados, desconsiderando tabelas auxiliares e derivadas (como as iniciadas por stg_ e tabelas contendo estatísticas previamente agregadas). Essa decisão permite compreender a estrutura original da base e preservar os relacionamentos entre as entidades, fornecendo uma base consistente para as etapas de preparação dos dados, análise exploratória e extração de regras de associação.</w:t>
+        <w:t xml:space="preserve">Foram analisadas apenas as tabelas principais da base de dados, desconsiderando tabelas auxiliares e derivadas (como as iniciadas por </w:t>
+      </w:r>
+      <w:proofErr w:type="spellStart"/>
+      <w:r>
+        <w:t>stg</w:t>
+      </w:r>
+      <w:proofErr w:type="spellEnd"/>
+      <w:r>
+        <w:t>_ e tabelas contendo estatísticas previamente agregadas). Essa decisão permite compreender a estrutura original da base e preservar os relacionamentos entre as entidades, fornecendo uma base consistente para as etapas de preparação dos dados, análise exploratória e extração de regras de associação.</w:t>
       </w:r>
     </w:p>
     <w:p>
@@ -2435,12 +2799,69 @@
           <w:bCs/>
         </w:rPr>
       </w:pPr>
-      <w:r>
-        <w:rPr>
-          <w:b/>
-          <w:bCs/>
-        </w:rPr>
-        <w:t>Movie Recommendation Database (movie_recomm)</w:t>
+      <w:proofErr w:type="spellStart"/>
+      <w:r>
+        <w:rPr>
+          <w:b/>
+          <w:bCs/>
+        </w:rPr>
+        <w:t>Movie</w:t>
+      </w:r>
+      <w:proofErr w:type="spellEnd"/>
+      <w:r>
+        <w:rPr>
+          <w:b/>
+          <w:bCs/>
+        </w:rPr>
+        <w:t xml:space="preserve"> </w:t>
+      </w:r>
+      <w:proofErr w:type="spellStart"/>
+      <w:r>
+        <w:rPr>
+          <w:b/>
+          <w:bCs/>
+        </w:rPr>
+        <w:t>Recommendation</w:t>
+      </w:r>
+      <w:proofErr w:type="spellEnd"/>
+      <w:r>
+        <w:rPr>
+          <w:b/>
+          <w:bCs/>
+        </w:rPr>
+        <w:t xml:space="preserve"> </w:t>
+      </w:r>
+      <w:proofErr w:type="spellStart"/>
+      <w:r>
+        <w:rPr>
+          <w:b/>
+          <w:bCs/>
+        </w:rPr>
+        <w:t>Database</w:t>
+      </w:r>
+      <w:proofErr w:type="spellEnd"/>
+      <w:r>
+        <w:rPr>
+          <w:b/>
+          <w:bCs/>
+        </w:rPr>
+        <w:t xml:space="preserve"> (</w:t>
+      </w:r>
+      <w:proofErr w:type="spellStart"/>
+      <w:r>
+        <w:rPr>
+          <w:b/>
+          <w:bCs/>
+        </w:rPr>
+        <w:t>movie_recomm</w:t>
+      </w:r>
+      <w:proofErr w:type="spellEnd"/>
+      <w:r>
+        <w:rPr>
+          <w:b/>
+          <w:bCs/>
+        </w:rPr>
+        <w:t>)</w:t>
       </w:r>
     </w:p>
     <w:p>
@@ -2651,6 +3072,7 @@
                 <w:bCs/>
               </w:rPr>
             </w:pPr>
+            <w:proofErr w:type="spellStart"/>
             <w:r>
               <w:rPr>
                 <w:b/>
@@ -2658,6 +3080,7 @@
               </w:rPr>
               <w:t>all_casts</w:t>
             </w:r>
+            <w:proofErr w:type="spellEnd"/>
           </w:p>
         </w:tc>
         <w:tc>
@@ -2744,6 +3167,7 @@
                 <w:bCs/>
               </w:rPr>
             </w:pPr>
+            <w:proofErr w:type="spellStart"/>
             <w:r>
               <w:rPr>
                 <w:b/>
@@ -2751,6 +3175,7 @@
               </w:rPr>
               <w:t>all_categories</w:t>
             </w:r>
+            <w:proofErr w:type="spellEnd"/>
           </w:p>
         </w:tc>
         <w:tc>
@@ -2837,6 +3262,7 @@
                 <w:bCs/>
               </w:rPr>
             </w:pPr>
+            <w:proofErr w:type="spellStart"/>
             <w:r>
               <w:rPr>
                 <w:b/>
@@ -2844,6 +3270,7 @@
               </w:rPr>
               <w:t>all_characters</w:t>
             </w:r>
+            <w:proofErr w:type="spellEnd"/>
           </w:p>
         </w:tc>
         <w:tc>
@@ -2930,6 +3357,7 @@
                 <w:bCs/>
               </w:rPr>
             </w:pPr>
+            <w:proofErr w:type="spellStart"/>
             <w:r>
               <w:rPr>
                 <w:b/>
@@ -2937,6 +3365,7 @@
               </w:rPr>
               <w:t>all_movie_aliases_iso</w:t>
             </w:r>
+            <w:proofErr w:type="spellEnd"/>
           </w:p>
         </w:tc>
         <w:tc>
@@ -3023,6 +3452,7 @@
                 <w:bCs/>
               </w:rPr>
             </w:pPr>
+            <w:proofErr w:type="spellStart"/>
             <w:r>
               <w:rPr>
                 <w:b/>
@@ -3030,6 +3460,7 @@
               </w:rPr>
               <w:t>all_people</w:t>
             </w:r>
+            <w:proofErr w:type="spellEnd"/>
           </w:p>
         </w:tc>
         <w:tc>
@@ -3116,6 +3547,7 @@
                 <w:bCs/>
               </w:rPr>
             </w:pPr>
+            <w:proofErr w:type="spellStart"/>
             <w:r>
               <w:rPr>
                 <w:b/>
@@ -3123,6 +3555,7 @@
               </w:rPr>
               <w:t>category_names</w:t>
             </w:r>
+            <w:proofErr w:type="spellEnd"/>
           </w:p>
         </w:tc>
         <w:tc>
@@ -3209,6 +3642,7 @@
                 <w:bCs/>
               </w:rPr>
             </w:pPr>
+            <w:proofErr w:type="spellStart"/>
             <w:r>
               <w:rPr>
                 <w:b/>
@@ -3216,6 +3650,7 @@
               </w:rPr>
               <w:t>job_names</w:t>
             </w:r>
+            <w:proofErr w:type="spellEnd"/>
           </w:p>
         </w:tc>
         <w:tc>
@@ -3302,6 +3737,7 @@
                 <w:bCs/>
               </w:rPr>
             </w:pPr>
+            <w:proofErr w:type="spellStart"/>
             <w:r>
               <w:rPr>
                 <w:b/>
@@ -3309,6 +3745,7 @@
               </w:rPr>
               <w:t>movie_categories</w:t>
             </w:r>
+            <w:proofErr w:type="spellEnd"/>
           </w:p>
         </w:tc>
         <w:tc>
@@ -3395,6 +3832,7 @@
                 <w:bCs/>
               </w:rPr>
             </w:pPr>
+            <w:proofErr w:type="spellStart"/>
             <w:r>
               <w:rPr>
                 <w:b/>
@@ -3402,6 +3840,7 @@
               </w:rPr>
               <w:t>movie_keywords</w:t>
             </w:r>
+            <w:proofErr w:type="spellEnd"/>
           </w:p>
         </w:tc>
         <w:tc>
@@ -3488,6 +3927,7 @@
                 <w:bCs/>
               </w:rPr>
             </w:pPr>
+            <w:proofErr w:type="spellStart"/>
             <w:r>
               <w:rPr>
                 <w:b/>
@@ -3496,27 +3936,44 @@
               <w:lastRenderedPageBreak/>
               <w:t>movielens_movies</w:t>
             </w:r>
-          </w:p>
-        </w:tc>
-        <w:tc>
-          <w:tcPr>
-            <w:tcW w:w="0" w:type="auto"/>
-            <w:vAlign w:val="center"/>
-            <w:hideMark/>
-          </w:tcPr>
-          <w:p>
-            <w:pPr>
-              <w:rPr>
-                <w:b/>
-                <w:bCs/>
-              </w:rPr>
-            </w:pPr>
-            <w:r>
-              <w:rPr>
-                <w:b/>
-                <w:bCs/>
-              </w:rPr>
-              <w:t>Cadastro dos filmes utilizados pelo conjunto MovieLens.</w:t>
+            <w:proofErr w:type="spellEnd"/>
+          </w:p>
+        </w:tc>
+        <w:tc>
+          <w:tcPr>
+            <w:tcW w:w="0" w:type="auto"/>
+            <w:vAlign w:val="center"/>
+            <w:hideMark/>
+          </w:tcPr>
+          <w:p>
+            <w:pPr>
+              <w:rPr>
+                <w:b/>
+                <w:bCs/>
+              </w:rPr>
+            </w:pPr>
+            <w:r>
+              <w:rPr>
+                <w:b/>
+                <w:bCs/>
+              </w:rPr>
+              <w:t xml:space="preserve">Cadastro dos filmes utilizados pelo conjunto </w:t>
+            </w:r>
+            <w:proofErr w:type="spellStart"/>
+            <w:r>
+              <w:rPr>
+                <w:b/>
+                <w:bCs/>
+              </w:rPr>
+              <w:t>MovieLens</w:t>
+            </w:r>
+            <w:proofErr w:type="spellEnd"/>
+            <w:r>
+              <w:rPr>
+                <w:b/>
+                <w:bCs/>
+              </w:rPr>
+              <w:t>.</w:t>
             </w:r>
           </w:p>
         </w:tc>
@@ -3582,6 +4039,7 @@
                 <w:bCs/>
               </w:rPr>
             </w:pPr>
+            <w:proofErr w:type="spellStart"/>
             <w:r>
               <w:rPr>
                 <w:b/>
@@ -3589,6 +4047,7 @@
               </w:rPr>
               <w:t>movielens_ratings</w:t>
             </w:r>
+            <w:proofErr w:type="spellEnd"/>
           </w:p>
         </w:tc>
         <w:tc>
@@ -3931,6 +4390,7 @@
                 <w:bCs/>
               </w:rPr>
             </w:pPr>
+            <w:proofErr w:type="spellStart"/>
             <w:r>
               <w:rPr>
                 <w:b/>
@@ -3938,21 +4398,23 @@
               </w:rPr>
               <w:t>all_people</w:t>
             </w:r>
-          </w:p>
-        </w:tc>
-        <w:tc>
-          <w:tcPr>
-            <w:tcW w:w="0" w:type="auto"/>
-            <w:vAlign w:val="center"/>
-            <w:hideMark/>
-          </w:tcPr>
-          <w:p>
-            <w:pPr>
-              <w:rPr>
-                <w:b/>
-                <w:bCs/>
-              </w:rPr>
-            </w:pPr>
+            <w:proofErr w:type="spellEnd"/>
+          </w:p>
+        </w:tc>
+        <w:tc>
+          <w:tcPr>
+            <w:tcW w:w="0" w:type="auto"/>
+            <w:vAlign w:val="center"/>
+            <w:hideMark/>
+          </w:tcPr>
+          <w:p>
+            <w:pPr>
+              <w:rPr>
+                <w:b/>
+                <w:bCs/>
+              </w:rPr>
+            </w:pPr>
+            <w:proofErr w:type="spellStart"/>
             <w:r>
               <w:rPr>
                 <w:b/>
@@ -3960,21 +4422,23 @@
               </w:rPr>
               <w:t>person_id</w:t>
             </w:r>
-          </w:p>
-        </w:tc>
-        <w:tc>
-          <w:tcPr>
-            <w:tcW w:w="0" w:type="auto"/>
-            <w:vAlign w:val="center"/>
-            <w:hideMark/>
-          </w:tcPr>
-          <w:p>
-            <w:pPr>
-              <w:rPr>
-                <w:b/>
-                <w:bCs/>
-              </w:rPr>
-            </w:pPr>
+            <w:proofErr w:type="spellEnd"/>
+          </w:p>
+        </w:tc>
+        <w:tc>
+          <w:tcPr>
+            <w:tcW w:w="0" w:type="auto"/>
+            <w:vAlign w:val="center"/>
+            <w:hideMark/>
+          </w:tcPr>
+          <w:p>
+            <w:pPr>
+              <w:rPr>
+                <w:b/>
+                <w:bCs/>
+              </w:rPr>
+            </w:pPr>
+            <w:proofErr w:type="spellStart"/>
             <w:r>
               <w:rPr>
                 <w:b/>
@@ -3982,6 +4446,7 @@
               </w:rPr>
               <w:t>all_casts</w:t>
             </w:r>
+            <w:proofErr w:type="spellEnd"/>
           </w:p>
         </w:tc>
       </w:tr>
@@ -4002,6 +4467,7 @@
                 <w:bCs/>
               </w:rPr>
             </w:pPr>
+            <w:proofErr w:type="spellStart"/>
             <w:r>
               <w:rPr>
                 <w:b/>
@@ -4009,21 +4475,23 @@
               </w:rPr>
               <w:t>job_names</w:t>
             </w:r>
-          </w:p>
-        </w:tc>
-        <w:tc>
-          <w:tcPr>
-            <w:tcW w:w="0" w:type="auto"/>
-            <w:vAlign w:val="center"/>
-            <w:hideMark/>
-          </w:tcPr>
-          <w:p>
-            <w:pPr>
-              <w:rPr>
-                <w:b/>
-                <w:bCs/>
-              </w:rPr>
-            </w:pPr>
+            <w:proofErr w:type="spellEnd"/>
+          </w:p>
+        </w:tc>
+        <w:tc>
+          <w:tcPr>
+            <w:tcW w:w="0" w:type="auto"/>
+            <w:vAlign w:val="center"/>
+            <w:hideMark/>
+          </w:tcPr>
+          <w:p>
+            <w:pPr>
+              <w:rPr>
+                <w:b/>
+                <w:bCs/>
+              </w:rPr>
+            </w:pPr>
+            <w:proofErr w:type="spellStart"/>
             <w:r>
               <w:rPr>
                 <w:b/>
@@ -4031,21 +4499,23 @@
               </w:rPr>
               <w:t>job_id</w:t>
             </w:r>
-          </w:p>
-        </w:tc>
-        <w:tc>
-          <w:tcPr>
-            <w:tcW w:w="0" w:type="auto"/>
-            <w:vAlign w:val="center"/>
-            <w:hideMark/>
-          </w:tcPr>
-          <w:p>
-            <w:pPr>
-              <w:rPr>
-                <w:b/>
-                <w:bCs/>
-              </w:rPr>
-            </w:pPr>
+            <w:proofErr w:type="spellEnd"/>
+          </w:p>
+        </w:tc>
+        <w:tc>
+          <w:tcPr>
+            <w:tcW w:w="0" w:type="auto"/>
+            <w:vAlign w:val="center"/>
+            <w:hideMark/>
+          </w:tcPr>
+          <w:p>
+            <w:pPr>
+              <w:rPr>
+                <w:b/>
+                <w:bCs/>
+              </w:rPr>
+            </w:pPr>
+            <w:proofErr w:type="spellStart"/>
             <w:r>
               <w:rPr>
                 <w:b/>
@@ -4053,6 +4523,7 @@
               </w:rPr>
               <w:t>all_casts</w:t>
             </w:r>
+            <w:proofErr w:type="spellEnd"/>
           </w:p>
         </w:tc>
       </w:tr>
@@ -4073,6 +4544,7 @@
                 <w:bCs/>
               </w:rPr>
             </w:pPr>
+            <w:proofErr w:type="spellStart"/>
             <w:r>
               <w:rPr>
                 <w:b/>
@@ -4080,21 +4552,23 @@
               </w:rPr>
               <w:t>category_names</w:t>
             </w:r>
-          </w:p>
-        </w:tc>
-        <w:tc>
-          <w:tcPr>
-            <w:tcW w:w="0" w:type="auto"/>
-            <w:vAlign w:val="center"/>
-            <w:hideMark/>
-          </w:tcPr>
-          <w:p>
-            <w:pPr>
-              <w:rPr>
-                <w:b/>
-                <w:bCs/>
-              </w:rPr>
-            </w:pPr>
+            <w:proofErr w:type="spellEnd"/>
+          </w:p>
+        </w:tc>
+        <w:tc>
+          <w:tcPr>
+            <w:tcW w:w="0" w:type="auto"/>
+            <w:vAlign w:val="center"/>
+            <w:hideMark/>
+          </w:tcPr>
+          <w:p>
+            <w:pPr>
+              <w:rPr>
+                <w:b/>
+                <w:bCs/>
+              </w:rPr>
+            </w:pPr>
+            <w:proofErr w:type="spellStart"/>
             <w:r>
               <w:rPr>
                 <w:b/>
@@ -4102,28 +4576,47 @@
               </w:rPr>
               <w:t>category_id</w:t>
             </w:r>
-          </w:p>
-        </w:tc>
-        <w:tc>
-          <w:tcPr>
-            <w:tcW w:w="0" w:type="auto"/>
-            <w:vAlign w:val="center"/>
-            <w:hideMark/>
-          </w:tcPr>
-          <w:p>
-            <w:pPr>
-              <w:rPr>
-                <w:b/>
-                <w:bCs/>
-              </w:rPr>
-            </w:pPr>
-            <w:r>
-              <w:rPr>
-                <w:b/>
-                <w:bCs/>
-              </w:rPr>
-              <w:t>movie_categories, movie_keywords</w:t>
-            </w:r>
+            <w:proofErr w:type="spellEnd"/>
+          </w:p>
+        </w:tc>
+        <w:tc>
+          <w:tcPr>
+            <w:tcW w:w="0" w:type="auto"/>
+            <w:vAlign w:val="center"/>
+            <w:hideMark/>
+          </w:tcPr>
+          <w:p>
+            <w:pPr>
+              <w:rPr>
+                <w:b/>
+                <w:bCs/>
+              </w:rPr>
+            </w:pPr>
+            <w:proofErr w:type="spellStart"/>
+            <w:r>
+              <w:rPr>
+                <w:b/>
+                <w:bCs/>
+              </w:rPr>
+              <w:t>movie_categories</w:t>
+            </w:r>
+            <w:proofErr w:type="spellEnd"/>
+            <w:r>
+              <w:rPr>
+                <w:b/>
+                <w:bCs/>
+              </w:rPr>
+              <w:t xml:space="preserve">, </w:t>
+            </w:r>
+            <w:proofErr w:type="spellStart"/>
+            <w:r>
+              <w:rPr>
+                <w:b/>
+                <w:bCs/>
+              </w:rPr>
+              <w:t>movie_keywords</w:t>
+            </w:r>
+            <w:proofErr w:type="spellEnd"/>
           </w:p>
         </w:tc>
       </w:tr>
@@ -4144,6 +4637,7 @@
                 <w:bCs/>
               </w:rPr>
             </w:pPr>
+            <w:proofErr w:type="spellStart"/>
             <w:r>
               <w:rPr>
                 <w:b/>
@@ -4151,21 +4645,23 @@
               </w:rPr>
               <w:t>all_movie_aliases_iso</w:t>
             </w:r>
-          </w:p>
-        </w:tc>
-        <w:tc>
-          <w:tcPr>
-            <w:tcW w:w="0" w:type="auto"/>
-            <w:vAlign w:val="center"/>
-            <w:hideMark/>
-          </w:tcPr>
-          <w:p>
-            <w:pPr>
-              <w:rPr>
-                <w:b/>
-                <w:bCs/>
-              </w:rPr>
-            </w:pPr>
+            <w:proofErr w:type="spellEnd"/>
+          </w:p>
+        </w:tc>
+        <w:tc>
+          <w:tcPr>
+            <w:tcW w:w="0" w:type="auto"/>
+            <w:vAlign w:val="center"/>
+            <w:hideMark/>
+          </w:tcPr>
+          <w:p>
+            <w:pPr>
+              <w:rPr>
+                <w:b/>
+                <w:bCs/>
+              </w:rPr>
+            </w:pPr>
+            <w:proofErr w:type="spellStart"/>
             <w:r>
               <w:rPr>
                 <w:b/>
@@ -4173,28 +4669,63 @@
               </w:rPr>
               <w:t>movie_id</w:t>
             </w:r>
-          </w:p>
-        </w:tc>
-        <w:tc>
-          <w:tcPr>
-            <w:tcW w:w="0" w:type="auto"/>
-            <w:vAlign w:val="center"/>
-            <w:hideMark/>
-          </w:tcPr>
-          <w:p>
-            <w:pPr>
-              <w:rPr>
-                <w:b/>
-                <w:bCs/>
-              </w:rPr>
-            </w:pPr>
-            <w:r>
-              <w:rPr>
-                <w:b/>
-                <w:bCs/>
-              </w:rPr>
-              <w:t>all_casts, movie_categories, movie_keywords</w:t>
-            </w:r>
+            <w:proofErr w:type="spellEnd"/>
+          </w:p>
+        </w:tc>
+        <w:tc>
+          <w:tcPr>
+            <w:tcW w:w="0" w:type="auto"/>
+            <w:vAlign w:val="center"/>
+            <w:hideMark/>
+          </w:tcPr>
+          <w:p>
+            <w:pPr>
+              <w:rPr>
+                <w:b/>
+                <w:bCs/>
+              </w:rPr>
+            </w:pPr>
+            <w:proofErr w:type="spellStart"/>
+            <w:r>
+              <w:rPr>
+                <w:b/>
+                <w:bCs/>
+              </w:rPr>
+              <w:t>all_casts</w:t>
+            </w:r>
+            <w:proofErr w:type="spellEnd"/>
+            <w:r>
+              <w:rPr>
+                <w:b/>
+                <w:bCs/>
+              </w:rPr>
+              <w:t xml:space="preserve">, </w:t>
+            </w:r>
+            <w:proofErr w:type="spellStart"/>
+            <w:r>
+              <w:rPr>
+                <w:b/>
+                <w:bCs/>
+              </w:rPr>
+              <w:t>movie_categories</w:t>
+            </w:r>
+            <w:proofErr w:type="spellEnd"/>
+            <w:r>
+              <w:rPr>
+                <w:b/>
+                <w:bCs/>
+              </w:rPr>
+              <w:t xml:space="preserve">, </w:t>
+            </w:r>
+            <w:proofErr w:type="spellStart"/>
+            <w:r>
+              <w:rPr>
+                <w:b/>
+                <w:bCs/>
+              </w:rPr>
+              <w:t>movie_keywords</w:t>
+            </w:r>
+            <w:proofErr w:type="spellEnd"/>
           </w:p>
         </w:tc>
       </w:tr>
@@ -4215,6 +4746,7 @@
                 <w:bCs/>
               </w:rPr>
             </w:pPr>
+            <w:proofErr w:type="spellStart"/>
             <w:r>
               <w:rPr>
                 <w:b/>
@@ -4222,21 +4754,23 @@
               </w:rPr>
               <w:t>movielens_movies</w:t>
             </w:r>
-          </w:p>
-        </w:tc>
-        <w:tc>
-          <w:tcPr>
-            <w:tcW w:w="0" w:type="auto"/>
-            <w:vAlign w:val="center"/>
-            <w:hideMark/>
-          </w:tcPr>
-          <w:p>
-            <w:pPr>
-              <w:rPr>
-                <w:b/>
-                <w:bCs/>
-              </w:rPr>
-            </w:pPr>
+            <w:proofErr w:type="spellEnd"/>
+          </w:p>
+        </w:tc>
+        <w:tc>
+          <w:tcPr>
+            <w:tcW w:w="0" w:type="auto"/>
+            <w:vAlign w:val="center"/>
+            <w:hideMark/>
+          </w:tcPr>
+          <w:p>
+            <w:pPr>
+              <w:rPr>
+                <w:b/>
+                <w:bCs/>
+              </w:rPr>
+            </w:pPr>
+            <w:proofErr w:type="spellStart"/>
             <w:r>
               <w:rPr>
                 <w:b/>
@@ -4244,21 +4778,23 @@
               </w:rPr>
               <w:t>movieId</w:t>
             </w:r>
-          </w:p>
-        </w:tc>
-        <w:tc>
-          <w:tcPr>
-            <w:tcW w:w="0" w:type="auto"/>
-            <w:vAlign w:val="center"/>
-            <w:hideMark/>
-          </w:tcPr>
-          <w:p>
-            <w:pPr>
-              <w:rPr>
-                <w:b/>
-                <w:bCs/>
-              </w:rPr>
-            </w:pPr>
+            <w:proofErr w:type="spellEnd"/>
+          </w:p>
+        </w:tc>
+        <w:tc>
+          <w:tcPr>
+            <w:tcW w:w="0" w:type="auto"/>
+            <w:vAlign w:val="center"/>
+            <w:hideMark/>
+          </w:tcPr>
+          <w:p>
+            <w:pPr>
+              <w:rPr>
+                <w:b/>
+                <w:bCs/>
+              </w:rPr>
+            </w:pPr>
+            <w:proofErr w:type="spellStart"/>
             <w:r>
               <w:rPr>
                 <w:b/>
@@ -4266,6 +4802,7 @@
               </w:rPr>
               <w:t>movielens_ratings</w:t>
             </w:r>
+            <w:proofErr w:type="spellEnd"/>
           </w:p>
         </w:tc>
       </w:tr>
@@ -4524,6 +5061,7 @@
                 <w:bCs/>
               </w:rPr>
             </w:pPr>
+            <w:proofErr w:type="spellStart"/>
             <w:r>
               <w:rPr>
                 <w:b/>
@@ -4531,6 +5069,7 @@
               </w:rPr>
               <w:t>results</w:t>
             </w:r>
+            <w:proofErr w:type="spellEnd"/>
           </w:p>
         </w:tc>
         <w:tc>
@@ -4573,6 +5112,7 @@
                 <w:bCs/>
               </w:rPr>
             </w:pPr>
+            <w:proofErr w:type="spellStart"/>
             <w:r>
               <w:rPr>
                 <w:b/>
@@ -4580,6 +5120,7 @@
               </w:rPr>
               <w:t>constructors</w:t>
             </w:r>
+            <w:proofErr w:type="spellEnd"/>
           </w:p>
         </w:tc>
         <w:tc>
@@ -4622,6 +5163,7 @@
                 <w:bCs/>
               </w:rPr>
             </w:pPr>
+            <w:proofErr w:type="spellStart"/>
             <w:r>
               <w:rPr>
                 <w:b/>
@@ -4629,6 +5171,7 @@
               </w:rPr>
               <w:t>races</w:t>
             </w:r>
+            <w:proofErr w:type="spellEnd"/>
           </w:p>
         </w:tc>
         <w:tc>
@@ -4671,6 +5214,7 @@
                 <w:bCs/>
               </w:rPr>
             </w:pPr>
+            <w:proofErr w:type="spellStart"/>
             <w:r>
               <w:rPr>
                 <w:b/>
@@ -4678,6 +5222,7 @@
               </w:rPr>
               <w:t>circuits</w:t>
             </w:r>
+            <w:proofErr w:type="spellEnd"/>
           </w:p>
         </w:tc>
         <w:tc>
@@ -4907,6 +5452,7 @@
                 <w:bCs/>
               </w:rPr>
             </w:pPr>
+            <w:proofErr w:type="spellStart"/>
             <w:r>
               <w:rPr>
                 <w:b/>
@@ -4914,21 +5460,23 @@
               </w:rPr>
               <w:t>results</w:t>
             </w:r>
-          </w:p>
-        </w:tc>
-        <w:tc>
-          <w:tcPr>
-            <w:tcW w:w="0" w:type="auto"/>
-            <w:vAlign w:val="center"/>
-            <w:hideMark/>
-          </w:tcPr>
-          <w:p>
-            <w:pPr>
-              <w:rPr>
-                <w:b/>
-                <w:bCs/>
-              </w:rPr>
-            </w:pPr>
+            <w:proofErr w:type="spellEnd"/>
+          </w:p>
+        </w:tc>
+        <w:tc>
+          <w:tcPr>
+            <w:tcW w:w="0" w:type="auto"/>
+            <w:vAlign w:val="center"/>
+            <w:hideMark/>
+          </w:tcPr>
+          <w:p>
+            <w:pPr>
+              <w:rPr>
+                <w:b/>
+                <w:bCs/>
+              </w:rPr>
+            </w:pPr>
+            <w:proofErr w:type="spellStart"/>
             <w:r>
               <w:rPr>
                 <w:b/>
@@ -4936,6 +5484,7 @@
               </w:rPr>
               <w:t>raceId</w:t>
             </w:r>
+            <w:proofErr w:type="spellEnd"/>
           </w:p>
         </w:tc>
         <w:tc>
@@ -4978,6 +5527,7 @@
                 <w:bCs/>
               </w:rPr>
             </w:pPr>
+            <w:proofErr w:type="spellStart"/>
             <w:r>
               <w:rPr>
                 <w:b/>
@@ -4985,21 +5535,23 @@
               </w:rPr>
               <w:t>results</w:t>
             </w:r>
-          </w:p>
-        </w:tc>
-        <w:tc>
-          <w:tcPr>
-            <w:tcW w:w="0" w:type="auto"/>
-            <w:vAlign w:val="center"/>
-            <w:hideMark/>
-          </w:tcPr>
-          <w:p>
-            <w:pPr>
-              <w:rPr>
-                <w:b/>
-                <w:bCs/>
-              </w:rPr>
-            </w:pPr>
+            <w:proofErr w:type="spellEnd"/>
+          </w:p>
+        </w:tc>
+        <w:tc>
+          <w:tcPr>
+            <w:tcW w:w="0" w:type="auto"/>
+            <w:vAlign w:val="center"/>
+            <w:hideMark/>
+          </w:tcPr>
+          <w:p>
+            <w:pPr>
+              <w:rPr>
+                <w:b/>
+                <w:bCs/>
+              </w:rPr>
+            </w:pPr>
+            <w:proofErr w:type="spellStart"/>
             <w:r>
               <w:rPr>
                 <w:b/>
@@ -5007,6 +5559,7 @@
               </w:rPr>
               <w:t>constructorId</w:t>
             </w:r>
+            <w:proofErr w:type="spellEnd"/>
           </w:p>
         </w:tc>
         <w:tc>
@@ -5049,6 +5602,7 @@
                 <w:bCs/>
               </w:rPr>
             </w:pPr>
+            <w:proofErr w:type="spellStart"/>
             <w:r>
               <w:rPr>
                 <w:b/>
@@ -5056,6 +5610,7 @@
               </w:rPr>
               <w:t>results</w:t>
             </w:r>
+            <w:proofErr w:type="spellEnd"/>
           </w:p>
         </w:tc>
         <w:tc>
@@ -5120,6 +5675,7 @@
                 <w:bCs/>
               </w:rPr>
             </w:pPr>
+            <w:proofErr w:type="spellStart"/>
             <w:r>
               <w:rPr>
                 <w:b/>
@@ -5127,6 +5683,7 @@
               </w:rPr>
               <w:t>results</w:t>
             </w:r>
+            <w:proofErr w:type="spellEnd"/>
           </w:p>
         </w:tc>
         <w:tc>
@@ -5191,6 +5748,7 @@
                 <w:bCs/>
               </w:rPr>
             </w:pPr>
+            <w:proofErr w:type="spellStart"/>
             <w:r>
               <w:rPr>
                 <w:b/>
@@ -5198,6 +5756,7 @@
               </w:rPr>
               <w:t>results</w:t>
             </w:r>
+            <w:proofErr w:type="spellEnd"/>
           </w:p>
         </w:tc>
         <w:tc>
@@ -5262,6 +5821,7 @@
                 <w:bCs/>
               </w:rPr>
             </w:pPr>
+            <w:proofErr w:type="spellStart"/>
             <w:r>
               <w:rPr>
                 <w:b/>
@@ -5269,21 +5829,23 @@
               </w:rPr>
               <w:t>results</w:t>
             </w:r>
-          </w:p>
-        </w:tc>
-        <w:tc>
-          <w:tcPr>
-            <w:tcW w:w="0" w:type="auto"/>
-            <w:vAlign w:val="center"/>
-            <w:hideMark/>
-          </w:tcPr>
-          <w:p>
-            <w:pPr>
-              <w:rPr>
-                <w:b/>
-                <w:bCs/>
-              </w:rPr>
-            </w:pPr>
+            <w:proofErr w:type="spellEnd"/>
+          </w:p>
+        </w:tc>
+        <w:tc>
+          <w:tcPr>
+            <w:tcW w:w="0" w:type="auto"/>
+            <w:vAlign w:val="center"/>
+            <w:hideMark/>
+          </w:tcPr>
+          <w:p>
+            <w:pPr>
+              <w:rPr>
+                <w:b/>
+                <w:bCs/>
+              </w:rPr>
+            </w:pPr>
+            <w:proofErr w:type="spellStart"/>
             <w:r>
               <w:rPr>
                 <w:b/>
@@ -5291,6 +5853,7 @@
               </w:rPr>
               <w:t>statusId</w:t>
             </w:r>
+            <w:proofErr w:type="spellEnd"/>
           </w:p>
         </w:tc>
         <w:tc>
@@ -5333,6 +5896,7 @@
                 <w:bCs/>
               </w:rPr>
             </w:pPr>
+            <w:proofErr w:type="spellStart"/>
             <w:r>
               <w:rPr>
                 <w:b/>
@@ -5340,21 +5904,23 @@
               </w:rPr>
               <w:t>constructors</w:t>
             </w:r>
-          </w:p>
-        </w:tc>
-        <w:tc>
-          <w:tcPr>
-            <w:tcW w:w="0" w:type="auto"/>
-            <w:vAlign w:val="center"/>
-            <w:hideMark/>
-          </w:tcPr>
-          <w:p>
-            <w:pPr>
-              <w:rPr>
-                <w:b/>
-                <w:bCs/>
-              </w:rPr>
-            </w:pPr>
+            <w:proofErr w:type="spellEnd"/>
+          </w:p>
+        </w:tc>
+        <w:tc>
+          <w:tcPr>
+            <w:tcW w:w="0" w:type="auto"/>
+            <w:vAlign w:val="center"/>
+            <w:hideMark/>
+          </w:tcPr>
+          <w:p>
+            <w:pPr>
+              <w:rPr>
+                <w:b/>
+                <w:bCs/>
+              </w:rPr>
+            </w:pPr>
+            <w:proofErr w:type="spellStart"/>
             <w:r>
               <w:rPr>
                 <w:b/>
@@ -5362,6 +5928,7 @@
               </w:rPr>
               <w:t>constructorId</w:t>
             </w:r>
+            <w:proofErr w:type="spellEnd"/>
           </w:p>
         </w:tc>
         <w:tc>
@@ -5404,6 +5971,7 @@
                 <w:bCs/>
               </w:rPr>
             </w:pPr>
+            <w:proofErr w:type="spellStart"/>
             <w:r>
               <w:rPr>
                 <w:b/>
@@ -5411,21 +5979,23 @@
               </w:rPr>
               <w:t>constructors</w:t>
             </w:r>
-          </w:p>
-        </w:tc>
-        <w:tc>
-          <w:tcPr>
-            <w:tcW w:w="0" w:type="auto"/>
-            <w:vAlign w:val="center"/>
-            <w:hideMark/>
-          </w:tcPr>
-          <w:p>
-            <w:pPr>
-              <w:rPr>
-                <w:b/>
-                <w:bCs/>
-              </w:rPr>
-            </w:pPr>
+            <w:proofErr w:type="spellEnd"/>
+          </w:p>
+        </w:tc>
+        <w:tc>
+          <w:tcPr>
+            <w:tcW w:w="0" w:type="auto"/>
+            <w:vAlign w:val="center"/>
+            <w:hideMark/>
+          </w:tcPr>
+          <w:p>
+            <w:pPr>
+              <w:rPr>
+                <w:b/>
+                <w:bCs/>
+              </w:rPr>
+            </w:pPr>
+            <w:proofErr w:type="spellStart"/>
             <w:r>
               <w:rPr>
                 <w:b/>
@@ -5433,6 +6003,7 @@
               </w:rPr>
               <w:t>name</w:t>
             </w:r>
+            <w:proofErr w:type="spellEnd"/>
           </w:p>
         </w:tc>
         <w:tc>
@@ -5475,6 +6046,7 @@
                 <w:bCs/>
               </w:rPr>
             </w:pPr>
+            <w:proofErr w:type="spellStart"/>
             <w:r>
               <w:rPr>
                 <w:b/>
@@ -5482,21 +6054,23 @@
               </w:rPr>
               <w:t>races</w:t>
             </w:r>
-          </w:p>
-        </w:tc>
-        <w:tc>
-          <w:tcPr>
-            <w:tcW w:w="0" w:type="auto"/>
-            <w:vAlign w:val="center"/>
-            <w:hideMark/>
-          </w:tcPr>
-          <w:p>
-            <w:pPr>
-              <w:rPr>
-                <w:b/>
-                <w:bCs/>
-              </w:rPr>
-            </w:pPr>
+            <w:proofErr w:type="spellEnd"/>
+          </w:p>
+        </w:tc>
+        <w:tc>
+          <w:tcPr>
+            <w:tcW w:w="0" w:type="auto"/>
+            <w:vAlign w:val="center"/>
+            <w:hideMark/>
+          </w:tcPr>
+          <w:p>
+            <w:pPr>
+              <w:rPr>
+                <w:b/>
+                <w:bCs/>
+              </w:rPr>
+            </w:pPr>
+            <w:proofErr w:type="spellStart"/>
             <w:r>
               <w:rPr>
                 <w:b/>
@@ -5504,6 +6078,7 @@
               </w:rPr>
               <w:t>raceId</w:t>
             </w:r>
+            <w:proofErr w:type="spellEnd"/>
           </w:p>
         </w:tc>
         <w:tc>
@@ -5546,6 +6121,7 @@
                 <w:bCs/>
               </w:rPr>
             </w:pPr>
+            <w:proofErr w:type="spellStart"/>
             <w:r>
               <w:rPr>
                 <w:b/>
@@ -5553,21 +6129,23 @@
               </w:rPr>
               <w:t>races</w:t>
             </w:r>
-          </w:p>
-        </w:tc>
-        <w:tc>
-          <w:tcPr>
-            <w:tcW w:w="0" w:type="auto"/>
-            <w:vAlign w:val="center"/>
-            <w:hideMark/>
-          </w:tcPr>
-          <w:p>
-            <w:pPr>
-              <w:rPr>
-                <w:b/>
-                <w:bCs/>
-              </w:rPr>
-            </w:pPr>
+            <w:proofErr w:type="spellEnd"/>
+          </w:p>
+        </w:tc>
+        <w:tc>
+          <w:tcPr>
+            <w:tcW w:w="0" w:type="auto"/>
+            <w:vAlign w:val="center"/>
+            <w:hideMark/>
+          </w:tcPr>
+          <w:p>
+            <w:pPr>
+              <w:rPr>
+                <w:b/>
+                <w:bCs/>
+              </w:rPr>
+            </w:pPr>
+            <w:proofErr w:type="spellStart"/>
             <w:r>
               <w:rPr>
                 <w:b/>
@@ -5575,6 +6153,7 @@
               </w:rPr>
               <w:t>year</w:t>
             </w:r>
+            <w:proofErr w:type="spellEnd"/>
           </w:p>
         </w:tc>
         <w:tc>
@@ -5617,6 +6196,7 @@
                 <w:bCs/>
               </w:rPr>
             </w:pPr>
+            <w:proofErr w:type="spellStart"/>
             <w:r>
               <w:rPr>
                 <w:b/>
@@ -5624,21 +6204,23 @@
               </w:rPr>
               <w:t>races</w:t>
             </w:r>
-          </w:p>
-        </w:tc>
-        <w:tc>
-          <w:tcPr>
-            <w:tcW w:w="0" w:type="auto"/>
-            <w:vAlign w:val="center"/>
-            <w:hideMark/>
-          </w:tcPr>
-          <w:p>
-            <w:pPr>
-              <w:rPr>
-                <w:b/>
-                <w:bCs/>
-              </w:rPr>
-            </w:pPr>
+            <w:proofErr w:type="spellEnd"/>
+          </w:p>
+        </w:tc>
+        <w:tc>
+          <w:tcPr>
+            <w:tcW w:w="0" w:type="auto"/>
+            <w:vAlign w:val="center"/>
+            <w:hideMark/>
+          </w:tcPr>
+          <w:p>
+            <w:pPr>
+              <w:rPr>
+                <w:b/>
+                <w:bCs/>
+              </w:rPr>
+            </w:pPr>
+            <w:proofErr w:type="spellStart"/>
             <w:r>
               <w:rPr>
                 <w:b/>
@@ -5646,6 +6228,7 @@
               </w:rPr>
               <w:t>circuitId</w:t>
             </w:r>
+            <w:proofErr w:type="spellEnd"/>
           </w:p>
         </w:tc>
         <w:tc>
@@ -5688,6 +6271,7 @@
                 <w:bCs/>
               </w:rPr>
             </w:pPr>
+            <w:proofErr w:type="spellStart"/>
             <w:r>
               <w:rPr>
                 <w:b/>
@@ -5695,21 +6279,23 @@
               </w:rPr>
               <w:t>circuits</w:t>
             </w:r>
-          </w:p>
-        </w:tc>
-        <w:tc>
-          <w:tcPr>
-            <w:tcW w:w="0" w:type="auto"/>
-            <w:vAlign w:val="center"/>
-            <w:hideMark/>
-          </w:tcPr>
-          <w:p>
-            <w:pPr>
-              <w:rPr>
-                <w:b/>
-                <w:bCs/>
-              </w:rPr>
-            </w:pPr>
+            <w:proofErr w:type="spellEnd"/>
+          </w:p>
+        </w:tc>
+        <w:tc>
+          <w:tcPr>
+            <w:tcW w:w="0" w:type="auto"/>
+            <w:vAlign w:val="center"/>
+            <w:hideMark/>
+          </w:tcPr>
+          <w:p>
+            <w:pPr>
+              <w:rPr>
+                <w:b/>
+                <w:bCs/>
+              </w:rPr>
+            </w:pPr>
+            <w:proofErr w:type="spellStart"/>
             <w:r>
               <w:rPr>
                 <w:b/>
@@ -5717,6 +6303,7 @@
               </w:rPr>
               <w:t>circuitId</w:t>
             </w:r>
+            <w:proofErr w:type="spellEnd"/>
           </w:p>
         </w:tc>
         <w:tc>
@@ -5759,6 +6346,7 @@
                 <w:bCs/>
               </w:rPr>
             </w:pPr>
+            <w:proofErr w:type="spellStart"/>
             <w:r>
               <w:rPr>
                 <w:b/>
@@ -5766,21 +6354,23 @@
               </w:rPr>
               <w:t>circuits</w:t>
             </w:r>
-          </w:p>
-        </w:tc>
-        <w:tc>
-          <w:tcPr>
-            <w:tcW w:w="0" w:type="auto"/>
-            <w:vAlign w:val="center"/>
-            <w:hideMark/>
-          </w:tcPr>
-          <w:p>
-            <w:pPr>
-              <w:rPr>
-                <w:b/>
-                <w:bCs/>
-              </w:rPr>
-            </w:pPr>
+            <w:proofErr w:type="spellEnd"/>
+          </w:p>
+        </w:tc>
+        <w:tc>
+          <w:tcPr>
+            <w:tcW w:w="0" w:type="auto"/>
+            <w:vAlign w:val="center"/>
+            <w:hideMark/>
+          </w:tcPr>
+          <w:p>
+            <w:pPr>
+              <w:rPr>
+                <w:b/>
+                <w:bCs/>
+              </w:rPr>
+            </w:pPr>
+            <w:proofErr w:type="spellStart"/>
             <w:r>
               <w:rPr>
                 <w:b/>
@@ -5788,6 +6378,7 @@
               </w:rPr>
               <w:t>name</w:t>
             </w:r>
+            <w:proofErr w:type="spellEnd"/>
           </w:p>
         </w:tc>
         <w:tc>
@@ -5830,6 +6421,7 @@
                 <w:bCs/>
               </w:rPr>
             </w:pPr>
+            <w:proofErr w:type="spellStart"/>
             <w:r>
               <w:rPr>
                 <w:b/>
@@ -5837,6 +6429,7 @@
               </w:rPr>
               <w:t>circuits</w:t>
             </w:r>
+            <w:proofErr w:type="spellEnd"/>
           </w:p>
         </w:tc>
         <w:tc>
@@ -5923,6 +6516,7 @@
                 <w:bCs/>
               </w:rPr>
             </w:pPr>
+            <w:proofErr w:type="spellStart"/>
             <w:r>
               <w:rPr>
                 <w:b/>
@@ -5930,6 +6524,7 @@
               </w:rPr>
               <w:t>statusId</w:t>
             </w:r>
+            <w:proofErr w:type="spellEnd"/>
           </w:p>
         </w:tc>
         <w:tc>
@@ -6086,7 +6681,23 @@
           <w:b/>
           <w:bCs/>
         </w:rPr>
-        <w:t>Também foi removido o atributo driverId, pois sua utilização geraria regras muito específicas relacionadas a pilotos individuais, reduzindo a capacidade de generalização dos padrões encontrados.</w:t>
+        <w:t xml:space="preserve">Também foi removido o atributo </w:t>
+      </w:r>
+      <w:proofErr w:type="spellStart"/>
+      <w:r>
+        <w:rPr>
+          <w:b/>
+          <w:bCs/>
+        </w:rPr>
+        <w:t>driverId</w:t>
+      </w:r>
+      <w:proofErr w:type="spellEnd"/>
+      <w:r>
+        <w:rPr>
+          <w:b/>
+          <w:bCs/>
+        </w:rPr>
+        <w:t>, pois sua utilização geraria regras muito específicas relacionadas a pilotos individuais, reduzindo a capacidade de generalização dos padrões encontrados.</w:t>
       </w:r>
     </w:p>
     <w:p>
@@ -6186,7 +6797,23 @@
           <w:b/>
           <w:bCs/>
         </w:rPr>
-        <w:t>Por fim, foi realizada a normalização dos atributos textuais. A única inconsistência encontrada ocorreu na coluna country da tabela circuits, em que os Estados Unidos eram representados tanto por USA quanto por United States. Para garantir consistência, ambos os valores foram padronizados para USA.</w:t>
+        <w:t xml:space="preserve">Por fim, foi realizada a normalização dos atributos textuais. A única inconsistência encontrada ocorreu na coluna country da tabela </w:t>
+      </w:r>
+      <w:proofErr w:type="spellStart"/>
+      <w:r>
+        <w:rPr>
+          <w:b/>
+          <w:bCs/>
+        </w:rPr>
+        <w:t>circuits</w:t>
+      </w:r>
+      <w:proofErr w:type="spellEnd"/>
+      <w:r>
+        <w:rPr>
+          <w:b/>
+          <w:bCs/>
+        </w:rPr>
+        <w:t>, em que os Estados Unidos eram representados tanto por USA quanto por United States. Para garantir consistência, ambos os valores foram padronizados para USA.</w:t>
       </w:r>
     </w:p>
     <w:p>
@@ -6394,6 +7021,7 @@
                 <w:bCs/>
               </w:rPr>
             </w:pPr>
+            <w:proofErr w:type="spellStart"/>
             <w:r>
               <w:rPr>
                 <w:b/>
@@ -6401,28 +7029,63 @@
               </w:rPr>
               <w:t>grid_categoria</w:t>
             </w:r>
-          </w:p>
-        </w:tc>
-        <w:tc>
-          <w:tcPr>
-            <w:tcW w:w="0" w:type="auto"/>
-            <w:vAlign w:val="center"/>
-            <w:hideMark/>
-          </w:tcPr>
-          <w:p>
-            <w:pPr>
-              <w:rPr>
-                <w:b/>
-                <w:bCs/>
-              </w:rPr>
-            </w:pPr>
-            <w:r>
-              <w:rPr>
-                <w:b/>
-                <w:bCs/>
-              </w:rPr>
-              <w:t>grid_front, grid_middle, grid_back</w:t>
-            </w:r>
+            <w:proofErr w:type="spellEnd"/>
+          </w:p>
+        </w:tc>
+        <w:tc>
+          <w:tcPr>
+            <w:tcW w:w="0" w:type="auto"/>
+            <w:vAlign w:val="center"/>
+            <w:hideMark/>
+          </w:tcPr>
+          <w:p>
+            <w:pPr>
+              <w:rPr>
+                <w:b/>
+                <w:bCs/>
+              </w:rPr>
+            </w:pPr>
+            <w:proofErr w:type="spellStart"/>
+            <w:r>
+              <w:rPr>
+                <w:b/>
+                <w:bCs/>
+              </w:rPr>
+              <w:t>grid_front</w:t>
+            </w:r>
+            <w:proofErr w:type="spellEnd"/>
+            <w:r>
+              <w:rPr>
+                <w:b/>
+                <w:bCs/>
+              </w:rPr>
+              <w:t xml:space="preserve">, </w:t>
+            </w:r>
+            <w:proofErr w:type="spellStart"/>
+            <w:r>
+              <w:rPr>
+                <w:b/>
+                <w:bCs/>
+              </w:rPr>
+              <w:t>grid_middle</w:t>
+            </w:r>
+            <w:proofErr w:type="spellEnd"/>
+            <w:r>
+              <w:rPr>
+                <w:b/>
+                <w:bCs/>
+              </w:rPr>
+              <w:t xml:space="preserve">, </w:t>
+            </w:r>
+            <w:proofErr w:type="spellStart"/>
+            <w:r>
+              <w:rPr>
+                <w:b/>
+                <w:bCs/>
+              </w:rPr>
+              <w:t>grid_back</w:t>
+            </w:r>
+            <w:proofErr w:type="spellEnd"/>
           </w:p>
         </w:tc>
       </w:tr>
@@ -6465,6 +7128,7 @@
                 <w:bCs/>
               </w:rPr>
             </w:pPr>
+            <w:proofErr w:type="spellStart"/>
             <w:r>
               <w:rPr>
                 <w:b/>
@@ -6472,28 +7136,79 @@
               </w:rPr>
               <w:t>position_categoria</w:t>
             </w:r>
-          </w:p>
-        </w:tc>
-        <w:tc>
-          <w:tcPr>
-            <w:tcW w:w="0" w:type="auto"/>
-            <w:vAlign w:val="center"/>
-            <w:hideMark/>
-          </w:tcPr>
-          <w:p>
-            <w:pPr>
-              <w:rPr>
-                <w:b/>
-                <w:bCs/>
-              </w:rPr>
-            </w:pPr>
-            <w:r>
-              <w:rPr>
-                <w:b/>
-                <w:bCs/>
-              </w:rPr>
-              <w:t>winner, podium, points_finish, outside_points, unclassified</w:t>
-            </w:r>
+            <w:proofErr w:type="spellEnd"/>
+          </w:p>
+        </w:tc>
+        <w:tc>
+          <w:tcPr>
+            <w:tcW w:w="0" w:type="auto"/>
+            <w:vAlign w:val="center"/>
+            <w:hideMark/>
+          </w:tcPr>
+          <w:p>
+            <w:pPr>
+              <w:rPr>
+                <w:b/>
+                <w:bCs/>
+              </w:rPr>
+            </w:pPr>
+            <w:proofErr w:type="spellStart"/>
+            <w:r>
+              <w:rPr>
+                <w:b/>
+                <w:bCs/>
+              </w:rPr>
+              <w:t>winner</w:t>
+            </w:r>
+            <w:proofErr w:type="spellEnd"/>
+            <w:r>
+              <w:rPr>
+                <w:b/>
+                <w:bCs/>
+              </w:rPr>
+              <w:t xml:space="preserve">, podium, </w:t>
+            </w:r>
+            <w:proofErr w:type="spellStart"/>
+            <w:r>
+              <w:rPr>
+                <w:b/>
+                <w:bCs/>
+              </w:rPr>
+              <w:t>points_finish</w:t>
+            </w:r>
+            <w:proofErr w:type="spellEnd"/>
+            <w:r>
+              <w:rPr>
+                <w:b/>
+                <w:bCs/>
+              </w:rPr>
+              <w:t xml:space="preserve">, </w:t>
+            </w:r>
+            <w:proofErr w:type="spellStart"/>
+            <w:r>
+              <w:rPr>
+                <w:b/>
+                <w:bCs/>
+              </w:rPr>
+              <w:t>outside_points</w:t>
+            </w:r>
+            <w:proofErr w:type="spellEnd"/>
+            <w:r>
+              <w:rPr>
+                <w:b/>
+                <w:bCs/>
+              </w:rPr>
+              <w:t xml:space="preserve">, </w:t>
+            </w:r>
+            <w:proofErr w:type="spellStart"/>
+            <w:r>
+              <w:rPr>
+                <w:b/>
+                <w:bCs/>
+              </w:rPr>
+              <w:t>unclassified</w:t>
+            </w:r>
+            <w:proofErr w:type="spellEnd"/>
           </w:p>
         </w:tc>
       </w:tr>
@@ -6536,6 +7251,7 @@
                 <w:bCs/>
               </w:rPr>
             </w:pPr>
+            <w:proofErr w:type="spellStart"/>
             <w:r>
               <w:rPr>
                 <w:b/>
@@ -6543,28 +7259,47 @@
               </w:rPr>
               <w:t>points_categoria</w:t>
             </w:r>
-          </w:p>
-        </w:tc>
-        <w:tc>
-          <w:tcPr>
-            <w:tcW w:w="0" w:type="auto"/>
-            <w:vAlign w:val="center"/>
-            <w:hideMark/>
-          </w:tcPr>
-          <w:p>
-            <w:pPr>
-              <w:rPr>
-                <w:b/>
-                <w:bCs/>
-              </w:rPr>
-            </w:pPr>
-            <w:r>
-              <w:rPr>
-                <w:b/>
-                <w:bCs/>
-              </w:rPr>
-              <w:t>scored_points, no_points</w:t>
-            </w:r>
+            <w:proofErr w:type="spellEnd"/>
+          </w:p>
+        </w:tc>
+        <w:tc>
+          <w:tcPr>
+            <w:tcW w:w="0" w:type="auto"/>
+            <w:vAlign w:val="center"/>
+            <w:hideMark/>
+          </w:tcPr>
+          <w:p>
+            <w:pPr>
+              <w:rPr>
+                <w:b/>
+                <w:bCs/>
+              </w:rPr>
+            </w:pPr>
+            <w:proofErr w:type="spellStart"/>
+            <w:r>
+              <w:rPr>
+                <w:b/>
+                <w:bCs/>
+              </w:rPr>
+              <w:t>scored_points</w:t>
+            </w:r>
+            <w:proofErr w:type="spellEnd"/>
+            <w:r>
+              <w:rPr>
+                <w:b/>
+                <w:bCs/>
+              </w:rPr>
+              <w:t xml:space="preserve">, </w:t>
+            </w:r>
+            <w:proofErr w:type="spellStart"/>
+            <w:r>
+              <w:rPr>
+                <w:b/>
+                <w:bCs/>
+              </w:rPr>
+              <w:t>no_points</w:t>
+            </w:r>
+            <w:proofErr w:type="spellEnd"/>
           </w:p>
         </w:tc>
       </w:tr>
@@ -7196,7 +7931,23 @@
           <w:b/>
           <w:bCs/>
         </w:rPr>
-        <w:t>Os resultados mostram que a Mercedes apresenta a maior taxa de vitórias da base analisada, seguida por Red Bull, Ferrari e McLaren. Embora Ferrari possua o maior número absoluto de vitórias, sua longa participação na categoria reduz sua taxa percentual quando comparada às equipes mais recentes.</w:t>
+        <w:t xml:space="preserve">Os resultados mostram que a Mercedes apresenta a maior taxa de vitórias da base analisada, seguida por </w:t>
+      </w:r>
+      <w:proofErr w:type="spellStart"/>
+      <w:r>
+        <w:rPr>
+          <w:b/>
+          <w:bCs/>
+        </w:rPr>
+        <w:t>Red</w:t>
+      </w:r>
+      <w:proofErr w:type="spellEnd"/>
+      <w:r>
+        <w:rPr>
+          <w:b/>
+          <w:bCs/>
+        </w:rPr>
+        <w:t xml:space="preserve"> Bull, Ferrari e McLaren. Embora Ferrari possua o maior número absoluto de vitórias, sua longa participação na categoria reduz sua taxa percentual quando comparada às equipes mais recentes.</w:t>
       </w:r>
     </w:p>
     <w:p>
@@ -7481,7 +8232,23 @@
           <w:b/>
           <w:bCs/>
         </w:rPr>
-        <w:t>A análise evidencia a alternância do domínio esportivo ao longo da história da Fórmula 1. Ferrari destacou-se nas décadas de 1950, 1970 e 2000, McLaren liderou os anos 1980, Williams dominou os anos 1990, Mercedes foi a principal equipe da década de 2010 e a Red Bull assumiu a liderança na década de 2020.</w:t>
+        <w:t xml:space="preserve">A análise evidencia a alternância do domínio esportivo ao longo da história da Fórmula 1. Ferrari destacou-se nas décadas de 1950, 1970 e 2000, McLaren liderou os anos 1980, Williams dominou os anos 1990, Mercedes foi a principal equipe da década de 2010 e a </w:t>
+      </w:r>
+      <w:proofErr w:type="spellStart"/>
+      <w:r>
+        <w:rPr>
+          <w:b/>
+          <w:bCs/>
+        </w:rPr>
+        <w:t>Red</w:t>
+      </w:r>
+      <w:proofErr w:type="spellEnd"/>
+      <w:r>
+        <w:rPr>
+          <w:b/>
+          <w:bCs/>
+        </w:rPr>
+        <w:t xml:space="preserve"> Bull assumiu a liderança na década de 2020.</w:t>
       </w:r>
     </w:p>
     <w:p>
@@ -7897,6 +8664,718 @@
         </w:rPr>
         <w:t>Esses resultados demonstram que a base apresenta consistência e contém padrões relevantes, justificando sua utilização na etapa seguinte de mineração de regras de associação.</w:t>
       </w:r>
+    </w:p>
+    <w:p>
+      <w:pPr>
+        <w:rPr>
+          <w:b/>
+          <w:bCs/>
+        </w:rPr>
+      </w:pPr>
+    </w:p>
+    <w:p>
+      <w:pPr>
+        <w:rPr>
+          <w:b/>
+          <w:bCs/>
+        </w:rPr>
+      </w:pPr>
+      <w:r>
+        <w:rPr>
+          <w:b/>
+          <w:bCs/>
+        </w:rPr>
+        <w:t>4.1 Estratégia adotada</w:t>
+      </w:r>
+    </w:p>
+    <w:p>
+      <w:pPr>
+        <w:rPr>
+          <w:b/>
+          <w:bCs/>
+        </w:rPr>
+      </w:pPr>
+      <w:r>
+        <w:rPr>
+          <w:b/>
+          <w:bCs/>
+        </w:rPr>
+        <w:t xml:space="preserve">Para a extração das regras de associação foi adotada a Estratégia A, na qual cada registro da tabela </w:t>
+      </w:r>
+      <w:proofErr w:type="spellStart"/>
+      <w:r>
+        <w:rPr>
+          <w:b/>
+          <w:bCs/>
+        </w:rPr>
+        <w:t>results</w:t>
+      </w:r>
+      <w:proofErr w:type="spellEnd"/>
+      <w:r>
+        <w:rPr>
+          <w:b/>
+          <w:bCs/>
+        </w:rPr>
+        <w:t xml:space="preserve"> é considerado uma transação. Cada registro representa o desempenho de um piloto em uma determinada corrida, permitindo analisar associações entre as características da prova e o resultado obtido.</w:t>
+      </w:r>
+    </w:p>
+    <w:p>
+      <w:pPr>
+        <w:rPr>
+          <w:b/>
+          <w:bCs/>
+        </w:rPr>
+      </w:pPr>
+      <w:r>
+        <w:rPr>
+          <w:b/>
+          <w:bCs/>
+        </w:rPr>
+        <w:t>As informações que compõem cada transação foram definidas durante a etapa de preparação dos dados e incluem atributos referentes à equipe, temporada, circuito, país, posição de largada, posição final, pontuação e status final da corrida.</w:t>
+      </w:r>
+    </w:p>
+    <w:p>
+      <w:pPr>
+        <w:rPr>
+          <w:b/>
+          <w:bCs/>
+        </w:rPr>
+      </w:pPr>
+      <w:r>
+        <w:rPr>
+          <w:b/>
+          <w:bCs/>
+        </w:rPr>
+        <w:t>Exemplo de transação:</w:t>
+      </w:r>
+    </w:p>
+    <w:p>
+      <w:pPr>
+        <w:rPr>
+          <w:b/>
+          <w:bCs/>
+        </w:rPr>
+      </w:pPr>
+      <w:r>
+        <w:rPr>
+          <w:b/>
+          <w:bCs/>
+        </w:rPr>
+        <w:t>{</w:t>
+      </w:r>
+    </w:p>
+    <w:p>
+      <w:pPr>
+        <w:rPr>
+          <w:b/>
+          <w:bCs/>
+        </w:rPr>
+      </w:pPr>
+      <w:proofErr w:type="spellStart"/>
+      <w:r>
+        <w:rPr>
+          <w:b/>
+          <w:bCs/>
+        </w:rPr>
+        <w:t>Equipe_Ferrari</w:t>
+      </w:r>
+      <w:proofErr w:type="spellEnd"/>
+      <w:r>
+        <w:rPr>
+          <w:b/>
+          <w:bCs/>
+        </w:rPr>
+        <w:t>,</w:t>
+      </w:r>
+    </w:p>
+    <w:p>
+      <w:pPr>
+        <w:rPr>
+          <w:b/>
+          <w:bCs/>
+        </w:rPr>
+      </w:pPr>
+      <w:r>
+        <w:rPr>
+          <w:b/>
+          <w:bCs/>
+        </w:rPr>
+        <w:t>Temporada_2024,</w:t>
+      </w:r>
+    </w:p>
+    <w:p>
+      <w:pPr>
+        <w:rPr>
+          <w:b/>
+          <w:bCs/>
+        </w:rPr>
+      </w:pPr>
+      <w:proofErr w:type="spellStart"/>
+      <w:r>
+        <w:rPr>
+          <w:b/>
+          <w:bCs/>
+        </w:rPr>
+        <w:t>Circuito_Monza</w:t>
+      </w:r>
+      <w:proofErr w:type="spellEnd"/>
+      <w:r>
+        <w:rPr>
+          <w:b/>
+          <w:bCs/>
+        </w:rPr>
+        <w:t>,</w:t>
+      </w:r>
+    </w:p>
+    <w:p>
+      <w:pPr>
+        <w:rPr>
+          <w:b/>
+          <w:bCs/>
+        </w:rPr>
+      </w:pPr>
+      <w:proofErr w:type="spellStart"/>
+      <w:r>
+        <w:rPr>
+          <w:b/>
+          <w:bCs/>
+        </w:rPr>
+        <w:t>Pais_Italia</w:t>
+      </w:r>
+      <w:proofErr w:type="spellEnd"/>
+      <w:r>
+        <w:rPr>
+          <w:b/>
+          <w:bCs/>
+        </w:rPr>
+        <w:t>,</w:t>
+      </w:r>
+    </w:p>
+    <w:p>
+      <w:pPr>
+        <w:rPr>
+          <w:b/>
+          <w:bCs/>
+        </w:rPr>
+      </w:pPr>
+      <w:proofErr w:type="spellStart"/>
+      <w:r>
+        <w:rPr>
+          <w:b/>
+          <w:bCs/>
+        </w:rPr>
+        <w:t>Grid_Front</w:t>
+      </w:r>
+      <w:proofErr w:type="spellEnd"/>
+      <w:r>
+        <w:rPr>
+          <w:b/>
+          <w:bCs/>
+        </w:rPr>
+        <w:t>,</w:t>
+      </w:r>
+    </w:p>
+    <w:p>
+      <w:pPr>
+        <w:rPr>
+          <w:b/>
+          <w:bCs/>
+        </w:rPr>
+      </w:pPr>
+      <w:proofErr w:type="spellStart"/>
+      <w:r>
+        <w:rPr>
+          <w:b/>
+          <w:bCs/>
+        </w:rPr>
+        <w:t>Winner</w:t>
+      </w:r>
+      <w:proofErr w:type="spellEnd"/>
+      <w:r>
+        <w:rPr>
+          <w:b/>
+          <w:bCs/>
+        </w:rPr>
+        <w:t>,</w:t>
+      </w:r>
+    </w:p>
+    <w:p>
+      <w:pPr>
+        <w:rPr>
+          <w:b/>
+          <w:bCs/>
+        </w:rPr>
+      </w:pPr>
+      <w:proofErr w:type="spellStart"/>
+      <w:r>
+        <w:rPr>
+          <w:b/>
+          <w:bCs/>
+        </w:rPr>
+        <w:t>Scored_Points</w:t>
+      </w:r>
+      <w:proofErr w:type="spellEnd"/>
+      <w:r>
+        <w:rPr>
+          <w:b/>
+          <w:bCs/>
+        </w:rPr>
+        <w:t>,</w:t>
+      </w:r>
+    </w:p>
+    <w:p>
+      <w:pPr>
+        <w:rPr>
+          <w:b/>
+          <w:bCs/>
+        </w:rPr>
+      </w:pPr>
+      <w:proofErr w:type="spellStart"/>
+      <w:r>
+        <w:rPr>
+          <w:b/>
+          <w:bCs/>
+        </w:rPr>
+        <w:t>Finished</w:t>
+      </w:r>
+      <w:proofErr w:type="spellEnd"/>
+    </w:p>
+    <w:p>
+      <w:pPr>
+        <w:rPr>
+          <w:b/>
+          <w:bCs/>
+        </w:rPr>
+      </w:pPr>
+      <w:r>
+        <w:rPr>
+          <w:b/>
+          <w:bCs/>
+        </w:rPr>
+        <w:t>}</w:t>
+      </w:r>
+    </w:p>
+    <w:p>
+      <w:pPr>
+        <w:rPr>
+          <w:b/>
+          <w:bCs/>
+        </w:rPr>
+      </w:pPr>
+      <w:r>
+        <w:rPr>
+          <w:b/>
+          <w:bCs/>
+        </w:rPr>
+        <w:t>Essa estratégia foi escolhida por preservar o maior nível de detalhamento da base de dados, resultando em aproximadamente 26 mil transações, quantidade adequada para a mineração de regras de associação.</w:t>
+      </w:r>
+    </w:p>
+    <w:p>
+      <w:pPr>
+        <w:rPr>
+          <w:b/>
+          <w:bCs/>
+        </w:rPr>
+      </w:pPr>
+      <w:r>
+        <w:rPr>
+          <w:b/>
+          <w:bCs/>
+        </w:rPr>
+        <w:lastRenderedPageBreak/>
+        <w:pict w14:anchorId="43D151C8">
+          <v:rect id="_x0000_i1147" style="width:0;height:1.5pt" o:hralign="center" o:hrstd="t" o:hr="t" fillcolor="#a0a0a0" stroked="f"/>
+        </w:pict>
+      </w:r>
+    </w:p>
+    <w:p>
+      <w:pPr>
+        <w:rPr>
+          <w:b/>
+          <w:bCs/>
+        </w:rPr>
+      </w:pPr>
+      <w:r>
+        <w:rPr>
+          <w:b/>
+          <w:bCs/>
+        </w:rPr>
+        <w:t xml:space="preserve">4.2 </w:t>
+      </w:r>
+      <w:proofErr w:type="spellStart"/>
+      <w:r>
+        <w:rPr>
+          <w:b/>
+          <w:bCs/>
+        </w:rPr>
+        <w:t>Discretização</w:t>
+      </w:r>
+      <w:proofErr w:type="spellEnd"/>
+      <w:r>
+        <w:rPr>
+          <w:b/>
+          <w:bCs/>
+        </w:rPr>
+        <w:t xml:space="preserve"> dos atributos numéricos</w:t>
+      </w:r>
+    </w:p>
+    <w:p>
+      <w:pPr>
+        <w:rPr>
+          <w:b/>
+          <w:bCs/>
+        </w:rPr>
+      </w:pPr>
+      <w:r>
+        <w:rPr>
+          <w:b/>
+          <w:bCs/>
+        </w:rPr>
+        <w:t xml:space="preserve">Embora a estratégia adotada seja baseada em registros individuais, foi necessário aplicar a </w:t>
+      </w:r>
+      <w:proofErr w:type="spellStart"/>
+      <w:r>
+        <w:rPr>
+          <w:b/>
+          <w:bCs/>
+        </w:rPr>
+        <w:t>discretização</w:t>
+      </w:r>
+      <w:proofErr w:type="spellEnd"/>
+      <w:r>
+        <w:rPr>
+          <w:b/>
+          <w:bCs/>
+        </w:rPr>
+        <w:t xml:space="preserve"> dos atributos numéricos antes da geração das transações, uma vez que o algoritmo </w:t>
+      </w:r>
+      <w:proofErr w:type="spellStart"/>
+      <w:r>
+        <w:rPr>
+          <w:b/>
+          <w:bCs/>
+        </w:rPr>
+        <w:t>Apriori</w:t>
+      </w:r>
+      <w:proofErr w:type="spellEnd"/>
+      <w:r>
+        <w:rPr>
+          <w:b/>
+          <w:bCs/>
+        </w:rPr>
+        <w:t xml:space="preserve"> trabalha com atributos categóricos.</w:t>
+      </w:r>
+    </w:p>
+    <w:p>
+      <w:pPr>
+        <w:rPr>
+          <w:b/>
+          <w:bCs/>
+        </w:rPr>
+      </w:pPr>
+      <w:r>
+        <w:rPr>
+          <w:b/>
+          <w:bCs/>
+        </w:rPr>
+        <w:t>Foram discretizados os seguintes atributos:</w:t>
+      </w:r>
+    </w:p>
+    <w:tbl>
+      <w:tblPr>
+        <w:tblW w:w="0" w:type="auto"/>
+        <w:tblCellSpacing w:w="15" w:type="dxa"/>
+        <w:tblCellMar>
+          <w:top w:w="15" w:type="dxa"/>
+          <w:left w:w="15" w:type="dxa"/>
+          <w:bottom w:w="15" w:type="dxa"/>
+          <w:right w:w="15" w:type="dxa"/>
+        </w:tblCellMar>
+        <w:tblLook w:val="04A0" w:firstRow="1" w:lastRow="0" w:firstColumn="1" w:lastColumn="0" w:noHBand="0" w:noVBand="1"/>
+      </w:tblPr>
+      <w:tblGrid>
+        <w:gridCol w:w="839"/>
+        <w:gridCol w:w="5292"/>
+      </w:tblGrid>
+      <w:tr>
+        <w:trPr>
+          <w:tblHeader/>
+          <w:tblCellSpacing w:w="15" w:type="dxa"/>
+        </w:trPr>
+        <w:tc>
+          <w:tcPr>
+            <w:tcW w:w="0" w:type="auto"/>
+            <w:vAlign w:val="center"/>
+            <w:hideMark/>
+          </w:tcPr>
+          <w:p>
+            <w:pPr>
+              <w:rPr>
+                <w:b/>
+                <w:bCs/>
+              </w:rPr>
+            </w:pPr>
+            <w:r>
+              <w:rPr>
+                <w:b/>
+                <w:bCs/>
+              </w:rPr>
+              <w:t>Atributo</w:t>
+            </w:r>
+          </w:p>
+        </w:tc>
+        <w:tc>
+          <w:tcPr>
+            <w:tcW w:w="0" w:type="auto"/>
+            <w:vAlign w:val="center"/>
+            <w:hideMark/>
+          </w:tcPr>
+          <w:p>
+            <w:pPr>
+              <w:rPr>
+                <w:b/>
+                <w:bCs/>
+              </w:rPr>
+            </w:pPr>
+            <w:r>
+              <w:rPr>
+                <w:b/>
+                <w:bCs/>
+              </w:rPr>
+              <w:t>Categorias</w:t>
+            </w:r>
+          </w:p>
+        </w:tc>
+      </w:tr>
+      <w:tr>
+        <w:trPr>
+          <w:tblCellSpacing w:w="15" w:type="dxa"/>
+        </w:trPr>
+        <w:tc>
+          <w:tcPr>
+            <w:tcW w:w="0" w:type="auto"/>
+            <w:vAlign w:val="center"/>
+            <w:hideMark/>
+          </w:tcPr>
+          <w:p>
+            <w:pPr>
+              <w:rPr>
+                <w:b/>
+                <w:bCs/>
+              </w:rPr>
+            </w:pPr>
+            <w:r>
+              <w:rPr>
+                <w:b/>
+                <w:bCs/>
+              </w:rPr>
+              <w:t>Grid</w:t>
+            </w:r>
+          </w:p>
+        </w:tc>
+        <w:tc>
+          <w:tcPr>
+            <w:tcW w:w="0" w:type="auto"/>
+            <w:vAlign w:val="center"/>
+            <w:hideMark/>
+          </w:tcPr>
+          <w:p>
+            <w:pPr>
+              <w:rPr>
+                <w:b/>
+                <w:bCs/>
+              </w:rPr>
+            </w:pPr>
+            <w:r>
+              <w:rPr>
+                <w:b/>
+                <w:bCs/>
+              </w:rPr>
+              <w:t>Grid Front, Grid Middle e Grid Back</w:t>
+            </w:r>
+          </w:p>
+        </w:tc>
+      </w:tr>
+      <w:tr>
+        <w:trPr>
+          <w:tblCellSpacing w:w="15" w:type="dxa"/>
+        </w:trPr>
+        <w:tc>
+          <w:tcPr>
+            <w:tcW w:w="0" w:type="auto"/>
+            <w:vAlign w:val="center"/>
+            <w:hideMark/>
+          </w:tcPr>
+          <w:p>
+            <w:pPr>
+              <w:rPr>
+                <w:b/>
+                <w:bCs/>
+              </w:rPr>
+            </w:pPr>
+            <w:r>
+              <w:rPr>
+                <w:b/>
+                <w:bCs/>
+              </w:rPr>
+              <w:t>Position</w:t>
+            </w:r>
+          </w:p>
+        </w:tc>
+        <w:tc>
+          <w:tcPr>
+            <w:tcW w:w="0" w:type="auto"/>
+            <w:vAlign w:val="center"/>
+            <w:hideMark/>
+          </w:tcPr>
+          <w:p>
+            <w:pPr>
+              <w:rPr>
+                <w:b/>
+                <w:bCs/>
+              </w:rPr>
+            </w:pPr>
+            <w:proofErr w:type="spellStart"/>
+            <w:r>
+              <w:rPr>
+                <w:b/>
+                <w:bCs/>
+              </w:rPr>
+              <w:t>Winner</w:t>
+            </w:r>
+            <w:proofErr w:type="spellEnd"/>
+            <w:r>
+              <w:rPr>
+                <w:b/>
+                <w:bCs/>
+              </w:rPr>
+              <w:t xml:space="preserve">, Podium, Points </w:t>
+            </w:r>
+            <w:proofErr w:type="spellStart"/>
+            <w:r>
+              <w:rPr>
+                <w:b/>
+                <w:bCs/>
+              </w:rPr>
+              <w:t>Finish</w:t>
+            </w:r>
+            <w:proofErr w:type="spellEnd"/>
+            <w:r>
+              <w:rPr>
+                <w:b/>
+                <w:bCs/>
+              </w:rPr>
+              <w:t xml:space="preserve">, </w:t>
+            </w:r>
+            <w:proofErr w:type="spellStart"/>
+            <w:r>
+              <w:rPr>
+                <w:b/>
+                <w:bCs/>
+              </w:rPr>
+              <w:t>Outside</w:t>
+            </w:r>
+            <w:proofErr w:type="spellEnd"/>
+            <w:r>
+              <w:rPr>
+                <w:b/>
+                <w:bCs/>
+              </w:rPr>
+              <w:t xml:space="preserve"> Points e No </w:t>
+            </w:r>
+            <w:proofErr w:type="spellStart"/>
+            <w:r>
+              <w:rPr>
+                <w:b/>
+                <w:bCs/>
+              </w:rPr>
+              <w:t>Finish</w:t>
+            </w:r>
+            <w:proofErr w:type="spellEnd"/>
+          </w:p>
+        </w:tc>
+      </w:tr>
+      <w:tr>
+        <w:trPr>
+          <w:tblCellSpacing w:w="15" w:type="dxa"/>
+        </w:trPr>
+        <w:tc>
+          <w:tcPr>
+            <w:tcW w:w="0" w:type="auto"/>
+            <w:vAlign w:val="center"/>
+            <w:hideMark/>
+          </w:tcPr>
+          <w:p>
+            <w:pPr>
+              <w:rPr>
+                <w:b/>
+                <w:bCs/>
+              </w:rPr>
+            </w:pPr>
+            <w:r>
+              <w:rPr>
+                <w:b/>
+                <w:bCs/>
+              </w:rPr>
+              <w:t>Points</w:t>
+            </w:r>
+          </w:p>
+        </w:tc>
+        <w:tc>
+          <w:tcPr>
+            <w:tcW w:w="0" w:type="auto"/>
+            <w:vAlign w:val="center"/>
+            <w:hideMark/>
+          </w:tcPr>
+          <w:p>
+            <w:pPr>
+              <w:rPr>
+                <w:b/>
+                <w:bCs/>
+              </w:rPr>
+            </w:pPr>
+            <w:proofErr w:type="spellStart"/>
+            <w:r>
+              <w:rPr>
+                <w:b/>
+                <w:bCs/>
+              </w:rPr>
+              <w:t>Scored</w:t>
+            </w:r>
+            <w:proofErr w:type="spellEnd"/>
+            <w:r>
+              <w:rPr>
+                <w:b/>
+                <w:bCs/>
+              </w:rPr>
+              <w:t xml:space="preserve"> Points e No Points</w:t>
+            </w:r>
+          </w:p>
+        </w:tc>
+      </w:tr>
+    </w:tbl>
+    <w:p>
+      <w:pPr>
+        <w:rPr>
+          <w:b/>
+          <w:bCs/>
+        </w:rPr>
+      </w:pPr>
+      <w:r>
+        <w:rPr>
+          <w:b/>
+          <w:bCs/>
+        </w:rPr>
+        <w:t>Após essa transformação, cada transação passou a ser composta apenas por itens categóricos, tornando os dados adequados para a aplicação do algoritmo de mineração de regras de associação.</w:t>
+      </w:r>
+    </w:p>
+    <w:p>
+      <w:pPr>
+        <w:rPr>
+          <w:b/>
+          <w:bCs/>
+        </w:rPr>
+      </w:pPr>
     </w:p>
     <w:p>
       <w:pPr>

</xml_diff>